<commit_message>
docs: cập nhật nội dung BT34.docx sau khi chỉnh sửa
</commit_message>
<xml_diff>
--- a/BT34.docx
+++ b/BT34.docx
@@ -5,2819 +5,1320 @@
     <w:p>
       <w:pPr>
         <w:jc w:val="center"/>
+        <w:rPr>
+          <w:sz w:val="24"/>
+          <w:szCs w:val="24"/>
+          <w:lang w:val="vi-VN"/>
+        </w:rPr>
       </w:pPr>
       <w:r>
         <w:rPr>
           <w:b/>
-          <w:sz w:val="22"/>
-        </w:rPr>
-        <w:t>TRƯ</w:t>
+          <w:sz w:val="24"/>
+          <w:szCs w:val="24"/>
+        </w:rPr>
+        <w:br/>
+        <w:t>THIẾT KẾ USER STORIES</w:t>
       </w:r>
       <w:r>
         <w:rPr>
           <w:b/>
-          <w:sz w:val="22"/>
-        </w:rPr>
-        <w:t>Ờ</w:t>
-      </w:r>
-      <w:r>
-        <w:rPr>
-          <w:b/>
-          <w:sz w:val="22"/>
-        </w:rPr>
-        <w:t>NG Đ</w:t>
-      </w:r>
-      <w:r>
-        <w:rPr>
-          <w:b/>
-          <w:sz w:val="22"/>
-        </w:rPr>
-        <w:t>Ạ</w:t>
-      </w:r>
-      <w:r>
-        <w:rPr>
-          <w:b/>
-          <w:sz w:val="22"/>
-        </w:rPr>
-        <w:t>I H</w:t>
-      </w:r>
-      <w:r>
-        <w:rPr>
-          <w:b/>
-          <w:sz w:val="22"/>
-        </w:rPr>
-        <w:t>Ọ</w:t>
-      </w:r>
-      <w:r>
-        <w:rPr>
-          <w:b/>
-          <w:sz w:val="22"/>
-        </w:rPr>
-        <w:t>C Đ</w:t>
-      </w:r>
-      <w:r>
-        <w:rPr>
-          <w:b/>
-          <w:sz w:val="22"/>
-        </w:rPr>
-        <w:t>Ồ</w:t>
-      </w:r>
-      <w:r>
-        <w:rPr>
-          <w:b/>
-          <w:sz w:val="22"/>
-        </w:rPr>
-        <w:t>NG THÁP — KHOA CÔNG NGH</w:t>
-      </w:r>
-      <w:r>
-        <w:rPr>
-          <w:b/>
-          <w:sz w:val="22"/>
-        </w:rPr>
-        <w:t>Ệ</w:t>
-      </w:r>
-      <w:r>
-        <w:rPr>
-          <w:b/>
-          <w:sz w:val="22"/>
-        </w:rPr>
-        <w:t xml:space="preserve"> VÀ K</w:t>
-      </w:r>
-      <w:r>
-        <w:rPr>
-          <w:b/>
-          <w:sz w:val="22"/>
-        </w:rPr>
-        <w:t>Ỹ</w:t>
-      </w:r>
-      <w:r>
-        <w:rPr>
-          <w:b/>
-          <w:sz w:val="22"/>
-        </w:rPr>
-        <w:t xml:space="preserve"> THU</w:t>
-      </w:r>
-      <w:r>
-        <w:rPr>
-          <w:b/>
-          <w:sz w:val="22"/>
-        </w:rPr>
-        <w:t>Ậ</w:t>
-      </w:r>
-      <w:r>
-        <w:rPr>
-          <w:b/>
-          <w:sz w:val="22"/>
-        </w:rPr>
-        <w:t>T</w:t>
-      </w:r>
-      <w:r>
-        <w:rPr>
-          <w:b/>
-          <w:sz w:val="22"/>
+          <w:sz w:val="24"/>
+          <w:szCs w:val="24"/>
         </w:rPr>
         <w:br/>
       </w:r>
       <w:r>
         <w:rPr>
-          <w:b/>
-          <w:sz w:val="23"/>
-        </w:rPr>
-        <w:t>BÀI T</w:t>
+          <w:sz w:val="24"/>
+          <w:szCs w:val="24"/>
+        </w:rPr>
+        <w:t>Họ tên: Lê Tuấn Kiệt</w:t>
       </w:r>
       <w:r>
         <w:rPr>
-          <w:b/>
-          <w:sz w:val="23"/>
-        </w:rPr>
-        <w:t>Ậ</w:t>
+          <w:sz w:val="24"/>
+          <w:szCs w:val="24"/>
+          <w:lang w:val="vi-VN"/>
+        </w:rPr>
+        <w:tab/>
       </w:r>
       <w:r>
         <w:rPr>
-          <w:b/>
-          <w:sz w:val="23"/>
-        </w:rPr>
-        <w:t>P CHƯƠNG 1 (IN4211): THI</w:t>
+          <w:sz w:val="24"/>
+          <w:szCs w:val="24"/>
+          <w:lang w:val="vi-VN"/>
+        </w:rPr>
+        <w:tab/>
       </w:r>
       <w:r>
         <w:rPr>
-          <w:b/>
-          <w:sz w:val="23"/>
-        </w:rPr>
-        <w:t>Ế</w:t>
+          <w:sz w:val="24"/>
+          <w:szCs w:val="24"/>
+        </w:rPr>
+        <w:t>MSSV: 0024417193</w:t>
       </w:r>
       <w:r>
         <w:rPr>
-          <w:b/>
-          <w:sz w:val="23"/>
-        </w:rPr>
-        <w:t>T K</w:t>
+          <w:sz w:val="24"/>
+          <w:szCs w:val="24"/>
+          <w:lang w:val="vi-VN"/>
+        </w:rPr>
+        <w:tab/>
       </w:r>
       <w:r>
         <w:rPr>
-          <w:b/>
-          <w:sz w:val="23"/>
-        </w:rPr>
-        <w:t>Ế</w:t>
-      </w:r>
-      <w:r>
-        <w:rPr>
-          <w:b/>
-          <w:sz w:val="23"/>
-        </w:rPr>
-        <w:t xml:space="preserve"> USER STORIES — H</w:t>
-      </w:r>
-      <w:r>
-        <w:rPr>
-          <w:b/>
-          <w:sz w:val="23"/>
-        </w:rPr>
-        <w:t>Ệ</w:t>
-      </w:r>
-      <w:r>
-        <w:rPr>
-          <w:b/>
-          <w:sz w:val="23"/>
-        </w:rPr>
-        <w:t xml:space="preserve"> TH</w:t>
-      </w:r>
-      <w:r>
-        <w:rPr>
-          <w:b/>
-          <w:sz w:val="23"/>
-        </w:rPr>
-        <w:t>Ố</w:t>
-      </w:r>
-      <w:r>
-        <w:rPr>
-          <w:b/>
-          <w:sz w:val="23"/>
-        </w:rPr>
-        <w:t>NG EDUHUB</w:t>
-      </w:r>
-      <w:r>
-        <w:rPr>
-          <w:b/>
-          <w:sz w:val="23"/>
-        </w:rPr>
-        <w:br/>
-      </w:r>
-      <w:r>
-        <w:t>H</w:t>
-      </w:r>
-      <w:r>
-        <w:t>ọ</w:t>
-      </w:r>
-      <w:r>
-        <w:t xml:space="preserve"> tên: Lê Tu</w:t>
-      </w:r>
-      <w:r>
-        <w:t>ấ</w:t>
-      </w:r>
-      <w:r>
-        <w:t>n Ki</w:t>
-      </w:r>
-      <w:r>
-        <w:t>ệ</w:t>
-      </w:r>
-      <w:r>
-        <w:t>t   |   MSSV: 0024417193   |   GVHD: ThS. Nguy</w:t>
-      </w:r>
-      <w:r>
-        <w:t>ễ</w:t>
-      </w:r>
-      <w:r>
-        <w:t>n Tu</w:t>
-      </w:r>
-      <w:r>
-        <w:t>ấ</w:t>
-      </w:r>
-      <w:r>
-        <w:t>n Ki</w:t>
-      </w:r>
-      <w:r>
-        <w:t>ệ</w:t>
-      </w:r>
-      <w:r>
-        <w:t>t</w:t>
+          <w:sz w:val="24"/>
+          <w:szCs w:val="24"/>
+          <w:lang w:val="vi-VN"/>
+        </w:rPr>
+        <w:tab/>
+        <w:t>Ngày 13/10/2026</w:t>
       </w:r>
     </w:p>
     <w:p>
       <w:pPr>
-        <w:spacing w:after="80"/>
-        <w:jc w:val="center"/>
+        <w:jc w:val="both"/>
+        <w:rPr>
+          <w:sz w:val="24"/>
+          <w:szCs w:val="24"/>
+          <w:lang w:val="vi-VN"/>
+        </w:rPr>
       </w:pPr>
-      <w:r>
-        <w:rPr>
-          <w:sz w:val="17"/>
-        </w:rPr>
-        <w:t>------------------------------------------------------------------------------------------------------------------------</w:t>
-      </w:r>
     </w:p>
     <w:p>
       <w:pPr>
         <w:spacing w:before="80" w:after="20"/>
+        <w:jc w:val="both"/>
+        <w:rPr>
+          <w:b/>
+          <w:bCs/>
+          <w:sz w:val="24"/>
+          <w:szCs w:val="24"/>
+          <w:lang w:val="vi-VN"/>
+        </w:rPr>
       </w:pPr>
       <w:r>
         <w:rPr>
           <w:b/>
-        </w:rPr>
-        <w:t>Story 1 [Sinh viên (Member)]: H</w:t>
+          <w:bCs/>
+          <w:sz w:val="24"/>
+          <w:szCs w:val="24"/>
+          <w:lang w:val="vi-VN"/>
+        </w:rPr>
+        <w:t xml:space="preserve">Story </w:t>
       </w:r>
       <w:r>
         <w:rPr>
           <w:b/>
-        </w:rPr>
-        <w:t>ủ</w:t>
+          <w:bCs/>
+          <w:sz w:val="24"/>
+          <w:szCs w:val="24"/>
+          <w:lang w:val="vi-VN"/>
+        </w:rPr>
+        <w:t>1 - S</w:t>
       </w:r>
       <w:r>
         <w:rPr>
           <w:b/>
-        </w:rPr>
-        <w:t>y đăng ký s</w:t>
+          <w:bCs/>
+          <w:sz w:val="24"/>
+          <w:szCs w:val="24"/>
+          <w:lang w:val="vi-VN"/>
+        </w:rPr>
+        <w:t xml:space="preserve">inh viên: </w:t>
       </w:r>
       <w:r>
         <w:rPr>
           <w:b/>
-        </w:rPr>
-        <w:t>ự</w:t>
+          <w:bCs/>
+          <w:sz w:val="24"/>
+          <w:szCs w:val="24"/>
+          <w:lang w:val="vi-VN"/>
+        </w:rPr>
+        <w:t>h</w:t>
       </w:r>
       <w:r>
         <w:rPr>
           <w:b/>
-        </w:rPr>
-        <w:t xml:space="preserve"> ki</w:t>
-      </w:r>
-      <w:r>
-        <w:rPr>
-          <w:b/>
-        </w:rPr>
-        <w:t>ệ</w:t>
-      </w:r>
-      <w:r>
-        <w:rPr>
-          <w:b/>
-        </w:rPr>
-        <w:t>n trư</w:t>
-      </w:r>
-      <w:r>
-        <w:rPr>
-          <w:b/>
-        </w:rPr>
-        <w:t>ớ</w:t>
-      </w:r>
-      <w:r>
-        <w:rPr>
-          <w:b/>
-        </w:rPr>
-        <w:t>c ngày di</w:t>
-      </w:r>
-      <w:r>
-        <w:rPr>
-          <w:b/>
-        </w:rPr>
-        <w:t>ễ</w:t>
-      </w:r>
-      <w:r>
-        <w:rPr>
-          <w:b/>
-        </w:rPr>
-        <w:t>n ra</w:t>
+          <w:bCs/>
+          <w:sz w:val="24"/>
+          <w:szCs w:val="24"/>
+          <w:lang w:val="vi-VN"/>
+        </w:rPr>
+        <w:t>ủy đăng ký sự kiện trước ngày diễn ra</w:t>
       </w:r>
     </w:p>
     <w:p>
       <w:pPr>
         <w:spacing w:after="20"/>
         <w:ind w:left="288"/>
+        <w:jc w:val="both"/>
+        <w:rPr>
+          <w:sz w:val="24"/>
+          <w:szCs w:val="24"/>
+          <w:lang w:val="vi-VN"/>
+        </w:rPr>
       </w:pPr>
       <w:r>
         <w:rPr>
-          <w:b/>
-        </w:rPr>
-        <w:t>• Mô t</w:t>
+          <w:sz w:val="24"/>
+          <w:szCs w:val="24"/>
+          <w:lang w:val="vi-VN"/>
+        </w:rPr>
+        <w:t>-</w:t>
       </w:r>
       <w:r>
         <w:rPr>
-          <w:b/>
-        </w:rPr>
-        <w:t>ả</w:t>
+          <w:sz w:val="24"/>
+          <w:szCs w:val="24"/>
+          <w:lang w:val="vi-VN"/>
+        </w:rPr>
+        <w:t xml:space="preserve"> Mô tả: </w:t>
       </w:r>
       <w:r>
         <w:rPr>
-          <w:b/>
-        </w:rPr>
-        <w:t xml:space="preserve">: </w:t>
+          <w:sz w:val="24"/>
+          <w:szCs w:val="24"/>
+          <w:lang w:val="vi-VN"/>
+        </w:rPr>
+        <w:t>l</w:t>
       </w:r>
       <w:r>
-        <w:t>Là m</w:t>
+        <w:rPr>
+          <w:sz w:val="24"/>
+          <w:szCs w:val="24"/>
+          <w:lang w:val="vi-VN"/>
+        </w:rPr>
+        <w:t xml:space="preserve">à một </w:t>
       </w:r>
       <w:r>
-        <w:t>ộ</w:t>
+        <w:rPr>
+          <w:sz w:val="24"/>
+          <w:szCs w:val="24"/>
+          <w:lang w:val="vi-VN"/>
+        </w:rPr>
+        <w:t>s</w:t>
       </w:r>
       <w:r>
-        <w:t>t Sinh viên đã đăng ký s</w:t>
-      </w:r>
-      <w:r>
-        <w:t>ự</w:t>
-      </w:r>
-      <w:r>
-        <w:t xml:space="preserve"> ki</w:t>
-      </w:r>
-      <w:r>
-        <w:t>ệ</w:t>
-      </w:r>
-      <w:r>
-        <w:t>n, tôi mu</w:t>
-      </w:r>
-      <w:r>
-        <w:t>ố</w:t>
-      </w:r>
-      <w:r>
-        <w:t>n h</w:t>
-      </w:r>
-      <w:r>
-        <w:t>ủ</w:t>
-      </w:r>
-      <w:r>
-        <w:t>y phi</w:t>
-      </w:r>
-      <w:r>
-        <w:t>ế</w:t>
-      </w:r>
-      <w:r>
-        <w:t>u đăng ký trư</w:t>
-      </w:r>
-      <w:r>
-        <w:t>ớ</w:t>
-      </w:r>
-      <w:r>
-        <w:t>c th</w:t>
-      </w:r>
-      <w:r>
-        <w:t>ờ</w:t>
-      </w:r>
-      <w:r>
-        <w:t>i đi</w:t>
-      </w:r>
-      <w:r>
-        <w:t>ể</w:t>
-      </w:r>
-      <w:r>
-        <w:t>m di</w:t>
-      </w:r>
-      <w:r>
-        <w:t>ễ</w:t>
-      </w:r>
-      <w:r>
-        <w:t>n ra khi có l</w:t>
-      </w:r>
-      <w:r>
-        <w:t>ị</w:t>
-      </w:r>
-      <w:r>
-        <w:t>ch b</w:t>
-      </w:r>
-      <w:r>
-        <w:t>ậ</w:t>
-      </w:r>
-      <w:r>
-        <w:t>n đ</w:t>
-      </w:r>
-      <w:r>
-        <w:t>ộ</w:t>
-      </w:r>
-      <w:r>
-        <w:t>t xu</w:t>
-      </w:r>
-      <w:r>
-        <w:t>ấ</w:t>
-      </w:r>
-      <w:r>
-        <w:t>t, đ</w:t>
-      </w:r>
-      <w:r>
-        <w:t>ể</w:t>
-      </w:r>
-      <w:r>
-        <w:t xml:space="preserve"> như</w:t>
-      </w:r>
-      <w:r>
-        <w:t>ờ</w:t>
-      </w:r>
-      <w:r>
-        <w:t>ng su</w:t>
-      </w:r>
-      <w:r>
-        <w:t>ấ</w:t>
-      </w:r>
-      <w:r>
-        <w:t>t tham gia cho b</w:t>
-      </w:r>
-      <w:r>
-        <w:t>ạ</w:t>
-      </w:r>
-      <w:r>
-        <w:t>n khác và gi</w:t>
-      </w:r>
-      <w:r>
-        <w:t>ữ</w:t>
-      </w:r>
-      <w:r>
-        <w:t xml:space="preserve"> uy tín cá nhân.</w:t>
+        <w:rPr>
+          <w:sz w:val="24"/>
+          <w:szCs w:val="24"/>
+          <w:lang w:val="vi-VN"/>
+        </w:rPr>
+        <w:t>inh viên đã đăng ký sự kiện, tôi muốn hủy phiếu đăng ký trước thời điểm diễn ra khi có lịch bận đột xuất, để nhường suất tham gia cho bạn khác và giữ uy tín cá nhân.</w:t>
       </w:r>
     </w:p>
     <w:p>
       <w:pPr>
         <w:spacing w:after="20"/>
         <w:ind w:left="288"/>
+        <w:jc w:val="both"/>
+        <w:rPr>
+          <w:sz w:val="24"/>
+          <w:szCs w:val="24"/>
+          <w:lang w:val="vi-VN"/>
+        </w:rPr>
       </w:pPr>
       <w:r>
         <w:rPr>
-          <w:b/>
-        </w:rPr>
-        <w:t>• Tiêu chí 1 (H</w:t>
+          <w:sz w:val="24"/>
+          <w:szCs w:val="24"/>
+          <w:lang w:val="vi-VN"/>
+        </w:rPr>
+        <w:t>-</w:t>
       </w:r>
       <w:r>
         <w:rPr>
-          <w:b/>
-        </w:rPr>
-        <w:t>ợ</w:t>
-      </w:r>
-      <w:r>
-        <w:rPr>
-          <w:b/>
-        </w:rPr>
-        <w:t>p l</w:t>
-      </w:r>
-      <w:r>
-        <w:rPr>
-          <w:b/>
-        </w:rPr>
-        <w:t>ệ</w:t>
-      </w:r>
-      <w:r>
-        <w:rPr>
-          <w:b/>
-        </w:rPr>
-        <w:t xml:space="preserve">): </w:t>
-      </w:r>
-      <w:r>
-        <w:t>Given phi</w:t>
-      </w:r>
-      <w:r>
-        <w:t>ế</w:t>
-      </w:r>
-      <w:r>
-        <w:t xml:space="preserve">u </w:t>
-      </w:r>
-      <w:r>
-        <w:t>ở</w:t>
-      </w:r>
-      <w:r>
-        <w:t xml:space="preserve"> tr</w:t>
-      </w:r>
-      <w:r>
-        <w:t>ạ</w:t>
-      </w:r>
-      <w:r>
-        <w:t>ng thái Pending ho</w:t>
-      </w:r>
-      <w:r>
-        <w:t>ặ</w:t>
-      </w:r>
-      <w:r>
-        <w:t>c Confirmed, When sinh viên h</w:t>
-      </w:r>
-      <w:r>
-        <w:t>ủ</w:t>
-      </w:r>
-      <w:r>
-        <w:t>y phi</w:t>
-      </w:r>
-      <w:r>
-        <w:t>ế</w:t>
-      </w:r>
-      <w:r>
-        <w:t>u, Then tr</w:t>
-      </w:r>
-      <w:r>
-        <w:t>ạ</w:t>
-      </w:r>
-      <w:r>
-        <w:t>ng thái chuy</w:t>
-      </w:r>
-      <w:r>
-        <w:t>ể</w:t>
-      </w:r>
-      <w:r>
-        <w:t>n thành Cancelled và hoàn l</w:t>
-      </w:r>
-      <w:r>
-        <w:t>ạ</w:t>
-      </w:r>
-      <w:r>
-        <w:t>i 1 ch</w:t>
-      </w:r>
-      <w:r>
-        <w:t>ỗ</w:t>
-      </w:r>
-      <w:r>
-        <w:t xml:space="preserve"> tr</w:t>
-      </w:r>
-      <w:r>
-        <w:t>ố</w:t>
-      </w:r>
-      <w:r>
-        <w:t>ng kh</w:t>
-      </w:r>
-      <w:r>
-        <w:t>ả</w:t>
-      </w:r>
-      <w:r>
-        <w:t xml:space="preserve"> d</w:t>
-      </w:r>
-      <w:r>
-        <w:t>ụ</w:t>
-      </w:r>
-      <w:r>
-        <w:t>ng cho s</w:t>
-      </w:r>
-      <w:r>
-        <w:t>ự</w:t>
-      </w:r>
-      <w:r>
-        <w:t xml:space="preserve"> ki</w:t>
-      </w:r>
-      <w:r>
-        <w:t>ệ</w:t>
-      </w:r>
-      <w:r>
-        <w:t>n.</w:t>
+          <w:sz w:val="24"/>
+          <w:szCs w:val="24"/>
+          <w:lang w:val="vi-VN"/>
+        </w:rPr>
+        <w:t xml:space="preserve"> Tiêu chí 1: Given phiếu ở trạng thái Pending hoặc Confirmed, When sinh viên hủy phiếu, Then trạng thái chuyển thành Cancelled và hoàn lại 1 chỗ trống khả dụng cho sự kiện.</w:t>
       </w:r>
     </w:p>
     <w:p>
       <w:pPr>
         <w:spacing w:after="60"/>
         <w:ind w:left="288"/>
+        <w:jc w:val="both"/>
+        <w:rPr>
+          <w:sz w:val="24"/>
+          <w:szCs w:val="24"/>
+          <w:lang w:val="vi-VN"/>
+        </w:rPr>
       </w:pPr>
       <w:r>
         <w:rPr>
-          <w:b/>
-        </w:rPr>
-        <w:t>• Tiêu chí 2 (Ngo</w:t>
+          <w:sz w:val="24"/>
+          <w:szCs w:val="24"/>
+          <w:lang w:val="vi-VN"/>
+        </w:rPr>
+        <w:t>-</w:t>
       </w:r>
       <w:r>
         <w:rPr>
-          <w:b/>
-        </w:rPr>
-        <w:t>ạ</w:t>
+          <w:sz w:val="24"/>
+          <w:szCs w:val="24"/>
+          <w:lang w:val="vi-VN"/>
+        </w:rPr>
+        <w:t xml:space="preserve"> Tiêu chí 2 (</w:t>
       </w:r>
       <w:r>
         <w:rPr>
-          <w:b/>
-        </w:rPr>
-        <w:t>i l</w:t>
+          <w:sz w:val="24"/>
+          <w:szCs w:val="24"/>
+          <w:lang w:val="vi-VN"/>
+        </w:rPr>
+        <w:t>n</w:t>
       </w:r>
       <w:r>
         <w:rPr>
-          <w:b/>
-        </w:rPr>
-        <w:t>ệ</w:t>
+          <w:sz w:val="24"/>
+          <w:szCs w:val="24"/>
+          <w:lang w:val="vi-VN"/>
+        </w:rPr>
+        <w:t>goại lệ/</w:t>
       </w:r>
       <w:r>
         <w:rPr>
-          <w:b/>
-        </w:rPr>
-        <w:t>/L</w:t>
+          <w:sz w:val="24"/>
+          <w:szCs w:val="24"/>
+          <w:lang w:val="vi-VN"/>
+        </w:rPr>
+        <w:t>l</w:t>
       </w:r>
       <w:r>
         <w:rPr>
-          <w:b/>
-        </w:rPr>
-        <w:t>ỗ</w:t>
+          <w:sz w:val="24"/>
+          <w:szCs w:val="24"/>
+          <w:lang w:val="vi-VN"/>
+        </w:rPr>
+        <w:t xml:space="preserve">ỗi): Given phiếu đã ở trạng thái Cancelled hoặc đã </w:t>
       </w:r>
       <w:r>
         <w:rPr>
-          <w:b/>
-        </w:rPr>
-        <w:t xml:space="preserve">i): </w:t>
+          <w:sz w:val="24"/>
+          <w:szCs w:val="24"/>
+          <w:lang w:val="vi-VN"/>
+        </w:rPr>
+        <w:t>Checki</w:t>
       </w:r>
       <w:r>
-        <w:t>Given phi</w:t>
-      </w:r>
-      <w:r>
-        <w:t>ế</w:t>
-      </w:r>
-      <w:r>
-        <w:t xml:space="preserve">u đã </w:t>
-      </w:r>
-      <w:r>
-        <w:t>ở</w:t>
-      </w:r>
-      <w:r>
-        <w:t xml:space="preserve"> tr</w:t>
-      </w:r>
-      <w:r>
-        <w:t>ạ</w:t>
-      </w:r>
-      <w:r>
-        <w:t>ng thái Cancelled ho</w:t>
-      </w:r>
-      <w:r>
-        <w:t>ặ</w:t>
-      </w:r>
-      <w:r>
-        <w:t>c đã đi</w:t>
-      </w:r>
-      <w:r>
-        <w:t>ể</w:t>
-      </w:r>
-      <w:r>
-        <w:t>m danh (CheckIn), When sinh viên h</w:t>
-      </w:r>
-      <w:r>
-        <w:t>ủ</w:t>
-      </w:r>
-      <w:r>
-        <w:t>y, Then h</w:t>
-      </w:r>
-      <w:r>
-        <w:t>ệ</w:t>
-      </w:r>
-      <w:r>
-        <w:t xml:space="preserve"> th</w:t>
-      </w:r>
-      <w:r>
-        <w:t>ố</w:t>
-      </w:r>
-      <w:r>
-        <w:t>ng t</w:t>
-      </w:r>
-      <w:r>
-        <w:t>ừ</w:t>
-      </w:r>
-      <w:r>
-        <w:t xml:space="preserve"> ch</w:t>
-      </w:r>
-      <w:r>
-        <w:t>ố</w:t>
-      </w:r>
-      <w:r>
-        <w:t>i và báo l</w:t>
-      </w:r>
-      <w:r>
-        <w:t>ỗ</w:t>
-      </w:r>
-      <w:r>
-        <w:t>i InvalidOperationException.</w:t>
+        <w:rPr>
+          <w:sz w:val="24"/>
+          <w:szCs w:val="24"/>
+          <w:lang w:val="vi-VN"/>
+        </w:rPr>
+        <w:t>n, When sinh viên hủy, Then hệ thống từ chối và báo lỗi.</w:t>
       </w:r>
     </w:p>
     <w:p>
       <w:pPr>
         <w:spacing w:before="80" w:after="20"/>
+        <w:jc w:val="both"/>
+        <w:rPr>
+          <w:b/>
+          <w:bCs/>
+          <w:sz w:val="24"/>
+          <w:szCs w:val="24"/>
+          <w:lang w:val="vi-VN"/>
+        </w:rPr>
       </w:pPr>
       <w:r>
         <w:rPr>
           <w:b/>
-        </w:rPr>
-        <w:t>Story 2 [Sinh viên (Member)]: Xem l</w:t>
+          <w:bCs/>
+          <w:sz w:val="24"/>
+          <w:szCs w:val="24"/>
+          <w:lang w:val="vi-VN"/>
+        </w:rPr>
+        <w:t xml:space="preserve">Story 2 </w:t>
       </w:r>
       <w:r>
         <w:rPr>
           <w:b/>
-        </w:rPr>
-        <w:t>ị</w:t>
+          <w:bCs/>
+          <w:sz w:val="24"/>
+          <w:szCs w:val="24"/>
+          <w:lang w:val="vi-VN"/>
+        </w:rPr>
+        <w:t xml:space="preserve">- </w:t>
       </w:r>
       <w:r>
         <w:rPr>
           <w:b/>
-        </w:rPr>
-        <w:t>ch s</w:t>
+          <w:bCs/>
+          <w:sz w:val="24"/>
+          <w:szCs w:val="24"/>
+          <w:lang w:val="vi-VN"/>
+        </w:rPr>
+        <w:t xml:space="preserve">Sinh viên: </w:t>
       </w:r>
       <w:r>
         <w:rPr>
           <w:b/>
-        </w:rPr>
-        <w:t>ử</w:t>
+          <w:bCs/>
+          <w:sz w:val="24"/>
+          <w:szCs w:val="24"/>
+          <w:lang w:val="vi-VN"/>
+        </w:rPr>
+        <w:t>x</w:t>
       </w:r>
       <w:r>
         <w:rPr>
           <w:b/>
-        </w:rPr>
-        <w:t xml:space="preserve"> các s</w:t>
-      </w:r>
-      <w:r>
-        <w:rPr>
-          <w:b/>
-        </w:rPr>
-        <w:t>ự</w:t>
-      </w:r>
-      <w:r>
-        <w:rPr>
-          <w:b/>
-        </w:rPr>
-        <w:t xml:space="preserve"> ki</w:t>
-      </w:r>
-      <w:r>
-        <w:rPr>
-          <w:b/>
-        </w:rPr>
-        <w:t>ệ</w:t>
-      </w:r>
-      <w:r>
-        <w:rPr>
-          <w:b/>
-        </w:rPr>
-        <w:t>n đã đăng ký và k</w:t>
-      </w:r>
-      <w:r>
-        <w:rPr>
-          <w:b/>
-        </w:rPr>
-        <w:t>ế</w:t>
-      </w:r>
-      <w:r>
-        <w:rPr>
-          <w:b/>
-        </w:rPr>
-        <w:t>t qu</w:t>
-      </w:r>
-      <w:r>
-        <w:rPr>
-          <w:b/>
-        </w:rPr>
-        <w:t>ả</w:t>
-      </w:r>
-      <w:r>
-        <w:rPr>
-          <w:b/>
-        </w:rPr>
-        <w:t xml:space="preserve"> tham gia</w:t>
+          <w:bCs/>
+          <w:sz w:val="24"/>
+          <w:szCs w:val="24"/>
+          <w:lang w:val="vi-VN"/>
+        </w:rPr>
+        <w:t>em lịch sử các sự kiện đã đăng ký và kết quả tham gia</w:t>
       </w:r>
     </w:p>
     <w:p>
       <w:pPr>
         <w:spacing w:after="20"/>
         <w:ind w:left="288"/>
+        <w:jc w:val="both"/>
+        <w:rPr>
+          <w:sz w:val="24"/>
+          <w:szCs w:val="24"/>
+          <w:lang w:val="vi-VN"/>
+        </w:rPr>
       </w:pPr>
       <w:r>
         <w:rPr>
-          <w:b/>
-        </w:rPr>
-        <w:t>• Mô t</w:t>
+          <w:sz w:val="24"/>
+          <w:szCs w:val="24"/>
+          <w:lang w:val="vi-VN"/>
+        </w:rPr>
+        <w:t>- M</w:t>
       </w:r>
       <w:r>
         <w:rPr>
-          <w:b/>
-        </w:rPr>
-        <w:t>ả</w:t>
+          <w:sz w:val="24"/>
+          <w:szCs w:val="24"/>
+          <w:lang w:val="vi-VN"/>
+        </w:rPr>
+        <w:t>ô tả:</w:t>
       </w:r>
       <w:r>
         <w:rPr>
-          <w:b/>
-        </w:rPr>
-        <w:t xml:space="preserve">: </w:t>
+          <w:sz w:val="24"/>
+          <w:szCs w:val="24"/>
+          <w:lang w:val="vi-VN"/>
+        </w:rPr>
+        <w:t xml:space="preserve"> l</w:t>
       </w:r>
       <w:r>
-        <w:t>Là m</w:t>
+        <w:rPr>
+          <w:sz w:val="24"/>
+          <w:szCs w:val="24"/>
+          <w:lang w:val="vi-VN"/>
+        </w:rPr>
+        <w:t xml:space="preserve">à một </w:t>
       </w:r>
       <w:r>
-        <w:t>ộ</w:t>
+        <w:rPr>
+          <w:sz w:val="24"/>
+          <w:szCs w:val="24"/>
+          <w:lang w:val="vi-VN"/>
+        </w:rPr>
+        <w:t>s</w:t>
       </w:r>
       <w:r>
-        <w:t>t Sinh viên, tôi mu</w:t>
-      </w:r>
-      <w:r>
-        <w:t>ố</w:t>
-      </w:r>
-      <w:r>
-        <w:t>n xem danh sách các s</w:t>
-      </w:r>
-      <w:r>
-        <w:t>ự</w:t>
-      </w:r>
-      <w:r>
-        <w:t xml:space="preserve"> ki</w:t>
-      </w:r>
-      <w:r>
-        <w:t>ệ</w:t>
-      </w:r>
-      <w:r>
-        <w:t>n đã đăng ký kèm tr</w:t>
-      </w:r>
-      <w:r>
-        <w:t>ạ</w:t>
-      </w:r>
-      <w:r>
-        <w:t>ng thái phi</w:t>
-      </w:r>
-      <w:r>
-        <w:t>ế</w:t>
-      </w:r>
-      <w:r>
-        <w:t>u và k</w:t>
-      </w:r>
-      <w:r>
-        <w:t>ế</w:t>
-      </w:r>
-      <w:r>
-        <w:t>t qu</w:t>
-      </w:r>
-      <w:r>
-        <w:t>ả</w:t>
-      </w:r>
-      <w:r>
-        <w:t xml:space="preserve"> đi</w:t>
-      </w:r>
-      <w:r>
-        <w:t>ể</w:t>
-      </w:r>
-      <w:r>
-        <w:t>m danh, đ</w:t>
-      </w:r>
-      <w:r>
-        <w:t>ể</w:t>
-      </w:r>
-      <w:r>
-        <w:t xml:space="preserve"> ch</w:t>
-      </w:r>
-      <w:r>
-        <w:t>ủ</w:t>
-      </w:r>
-      <w:r>
-        <w:t xml:space="preserve"> đ</w:t>
-      </w:r>
-      <w:r>
-        <w:t>ộ</w:t>
-      </w:r>
-      <w:r>
-        <w:t>ng theo dõi l</w:t>
-      </w:r>
-      <w:r>
-        <w:t>ị</w:t>
-      </w:r>
-      <w:r>
-        <w:t>ch trình tham gia ngo</w:t>
-      </w:r>
-      <w:r>
-        <w:t>ạ</w:t>
-      </w:r>
-      <w:r>
-        <w:t>i khóa c</w:t>
-      </w:r>
-      <w:r>
-        <w:t>ủ</w:t>
-      </w:r>
-      <w:r>
-        <w:t>a b</w:t>
-      </w:r>
-      <w:r>
-        <w:t>ả</w:t>
-      </w:r>
-      <w:r>
-        <w:t>n thân.</w:t>
+        <w:rPr>
+          <w:sz w:val="24"/>
+          <w:szCs w:val="24"/>
+          <w:lang w:val="vi-VN"/>
+        </w:rPr>
+        <w:t>inh viên, tôi muốn xem danh sách các sự kiện đã đăng ký kèm trạng thái phiếu và kết quả điểm danh, để chủ động theo dõi lịch trình tham gia ngoại khóa của bản thân.</w:t>
       </w:r>
     </w:p>
     <w:p>
       <w:pPr>
         <w:spacing w:after="20"/>
         <w:ind w:left="288"/>
+        <w:jc w:val="both"/>
+        <w:rPr>
+          <w:sz w:val="24"/>
+          <w:szCs w:val="24"/>
+          <w:lang w:val="vi-VN"/>
+        </w:rPr>
       </w:pPr>
       <w:r>
         <w:rPr>
-          <w:b/>
-        </w:rPr>
-        <w:t>• Tiêu chí 1 (H</w:t>
+          <w:sz w:val="24"/>
+          <w:szCs w:val="24"/>
+          <w:lang w:val="vi-VN"/>
+        </w:rPr>
+        <w:t>-</w:t>
       </w:r>
       <w:r>
         <w:rPr>
-          <w:b/>
-        </w:rPr>
-        <w:t>ợ</w:t>
+          <w:sz w:val="24"/>
+          <w:szCs w:val="24"/>
+          <w:lang w:val="vi-VN"/>
+        </w:rPr>
+        <w:t xml:space="preserve"> Tiêu chí 1 (</w:t>
       </w:r>
       <w:r>
         <w:rPr>
-          <w:b/>
-        </w:rPr>
-        <w:t>p l</w:t>
+          <w:sz w:val="24"/>
+          <w:szCs w:val="24"/>
+          <w:lang w:val="vi-VN"/>
+        </w:rPr>
+        <w:t>h</w:t>
       </w:r>
       <w:r>
         <w:rPr>
-          <w:b/>
-        </w:rPr>
-        <w:t>ệ</w:t>
-      </w:r>
-      <w:r>
-        <w:rPr>
-          <w:b/>
-        </w:rPr>
-        <w:t xml:space="preserve">): </w:t>
-      </w:r>
-      <w:r>
-        <w:t>Given sinh viên đã có phi</w:t>
-      </w:r>
-      <w:r>
-        <w:t>ế</w:t>
-      </w:r>
-      <w:r>
-        <w:t>u đăng ký, When xem l</w:t>
-      </w:r>
-      <w:r>
-        <w:t>ị</w:t>
-      </w:r>
-      <w:r>
-        <w:t>ch s</w:t>
-      </w:r>
-      <w:r>
-        <w:t>ử</w:t>
-      </w:r>
-      <w:r>
-        <w:t>, Then h</w:t>
-      </w:r>
-      <w:r>
-        <w:t>ệ</w:t>
-      </w:r>
-      <w:r>
-        <w:t xml:space="preserve"> th</w:t>
-      </w:r>
-      <w:r>
-        <w:t>ố</w:t>
-      </w:r>
-      <w:r>
-        <w:t>ng hi</w:t>
-      </w:r>
-      <w:r>
-        <w:t>ể</w:t>
-      </w:r>
-      <w:r>
-        <w:t>n th</w:t>
-      </w:r>
-      <w:r>
-        <w:t>ị</w:t>
-      </w:r>
-      <w:r>
-        <w:t xml:space="preserve"> danh sách s</w:t>
-      </w:r>
-      <w:r>
-        <w:t>ự</w:t>
-      </w:r>
-      <w:r>
-        <w:t xml:space="preserve"> ki</w:t>
-      </w:r>
-      <w:r>
-        <w:t>ệ</w:t>
-      </w:r>
-      <w:r>
-        <w:t>n (tên s</w:t>
-      </w:r>
-      <w:r>
-        <w:t>ự</w:t>
-      </w:r>
-      <w:r>
-        <w:t xml:space="preserve"> ki</w:t>
-      </w:r>
-      <w:r>
-        <w:t>ệ</w:t>
-      </w:r>
-      <w:r>
-        <w:t>n, ngày t</w:t>
-      </w:r>
-      <w:r>
-        <w:t>ổ</w:t>
-      </w:r>
-      <w:r>
-        <w:t xml:space="preserve"> ch</w:t>
-      </w:r>
-      <w:r>
-        <w:t>ứ</w:t>
-      </w:r>
-      <w:r>
-        <w:t>c, tr</w:t>
-      </w:r>
-      <w:r>
-        <w:t>ạ</w:t>
-      </w:r>
-      <w:r>
-        <w:t>ng thái phi</w:t>
-      </w:r>
-      <w:r>
-        <w:t>ế</w:t>
-      </w:r>
-      <w:r>
-        <w:t>u và k</w:t>
-      </w:r>
-      <w:r>
-        <w:t>ế</w:t>
-      </w:r>
-      <w:r>
-        <w:t>t qu</w:t>
-      </w:r>
-      <w:r>
-        <w:t>ả</w:t>
-      </w:r>
-      <w:r>
-        <w:t xml:space="preserve"> đi</w:t>
-      </w:r>
-      <w:r>
-        <w:t>ể</w:t>
-      </w:r>
-      <w:r>
-        <w:t>m danh).</w:t>
+          <w:sz w:val="24"/>
+          <w:szCs w:val="24"/>
+          <w:lang w:val="vi-VN"/>
+        </w:rPr>
+        <w:t>ợp lệ): Given sinh viên đã có phiếu đăng ký, When xem lịch sử, Then hệ thống hiển thị danh sách sự kiện (tên sự kiện, ngày tổ chức, trạng thái phiếu và kết quả điểm danh).</w:t>
       </w:r>
     </w:p>
     <w:p>
       <w:pPr>
         <w:spacing w:after="60"/>
         <w:ind w:left="288"/>
+        <w:jc w:val="both"/>
+        <w:rPr>
+          <w:sz w:val="24"/>
+          <w:szCs w:val="24"/>
+          <w:lang w:val="vi-VN"/>
+        </w:rPr>
       </w:pPr>
       <w:r>
         <w:rPr>
-          <w:b/>
-        </w:rPr>
-        <w:t>• Tiêu chí 2 (Ngo</w:t>
+          <w:sz w:val="24"/>
+          <w:szCs w:val="24"/>
+          <w:lang w:val="vi-VN"/>
+        </w:rPr>
+        <w:t>-</w:t>
       </w:r>
       <w:r>
         <w:rPr>
-          <w:b/>
-        </w:rPr>
-        <w:t>ạ</w:t>
+          <w:sz w:val="24"/>
+          <w:szCs w:val="24"/>
+          <w:lang w:val="vi-VN"/>
+        </w:rPr>
+        <w:t xml:space="preserve"> Tiêu chí 2 (</w:t>
       </w:r>
       <w:r>
         <w:rPr>
-          <w:b/>
-        </w:rPr>
-        <w:t>i l</w:t>
+          <w:sz w:val="24"/>
+          <w:szCs w:val="24"/>
+          <w:lang w:val="vi-VN"/>
+        </w:rPr>
+        <w:t>n</w:t>
       </w:r>
       <w:r>
         <w:rPr>
-          <w:b/>
-        </w:rPr>
-        <w:t>ệ</w:t>
+          <w:sz w:val="24"/>
+          <w:szCs w:val="24"/>
+          <w:lang w:val="vi-VN"/>
+        </w:rPr>
+        <w:t>goại lệ/</w:t>
       </w:r>
       <w:r>
         <w:rPr>
-          <w:b/>
-        </w:rPr>
-        <w:t>/L</w:t>
+          <w:sz w:val="24"/>
+          <w:szCs w:val="24"/>
+          <w:lang w:val="vi-VN"/>
+        </w:rPr>
+        <w:t>l</w:t>
       </w:r>
       <w:r>
         <w:rPr>
+          <w:sz w:val="24"/>
+          <w:szCs w:val="24"/>
+          <w:lang w:val="vi-VN"/>
+        </w:rPr>
+        <w:t>ỗi): Given sinh viên chưa đăng ký sự kiện nào, When xem lịch sử, Then hệ thống thông báo chưa tham gia và gợi ý các sự kiện đang mở còn chỗ.</w:t>
+      </w:r>
+    </w:p>
+    <w:p>
+      <w:pPr>
+        <w:spacing w:before="80" w:after="20"/>
+        <w:jc w:val="both"/>
+        <w:rPr>
           <w:b/>
-        </w:rPr>
-        <w:t>ỗ</w:t>
+          <w:bCs/>
+          <w:sz w:val="24"/>
+          <w:szCs w:val="24"/>
+          <w:lang w:val="vi-VN"/>
+        </w:rPr>
+      </w:pPr>
+      <w:r>
+        <w:rPr>
+          <w:b/>
+          <w:bCs/>
+          <w:sz w:val="24"/>
+          <w:szCs w:val="24"/>
+          <w:lang w:val="vi-VN"/>
+        </w:rPr>
+        <w:t>Story 3</w:t>
       </w:r>
       <w:r>
         <w:rPr>
           <w:b/>
-        </w:rPr>
-        <w:t xml:space="preserve">i): </w:t>
+          <w:bCs/>
+          <w:sz w:val="24"/>
+          <w:szCs w:val="24"/>
+          <w:lang w:val="vi-VN"/>
+        </w:rPr>
+        <w:t xml:space="preserve"> -</w:t>
       </w:r>
       <w:r>
-        <w:t>Given sinh viên chưa đăng ký s</w:t>
+        <w:rPr>
+          <w:b/>
+          <w:bCs/>
+          <w:sz w:val="24"/>
+          <w:szCs w:val="24"/>
+          <w:lang w:val="vi-VN"/>
+        </w:rPr>
+        <w:t xml:space="preserve"> Ban chủ nhiệm CLB: </w:t>
       </w:r>
       <w:r>
-        <w:t>ự</w:t>
+        <w:rPr>
+          <w:b/>
+          <w:bCs/>
+          <w:sz w:val="24"/>
+          <w:szCs w:val="24"/>
+          <w:lang w:val="vi-VN"/>
+        </w:rPr>
+        <w:t>p</w:t>
       </w:r>
       <w:r>
-        <w:t xml:space="preserve"> ki</w:t>
+        <w:rPr>
+          <w:b/>
+          <w:bCs/>
+          <w:sz w:val="24"/>
+          <w:szCs w:val="24"/>
+          <w:lang w:val="vi-VN"/>
+        </w:rPr>
+        <w:t>hê duyệt xác nhận phiếu đăng ký sự kiện</w:t>
+      </w:r>
+    </w:p>
+    <w:p>
+      <w:pPr>
+        <w:spacing w:after="20"/>
+        <w:ind w:left="288"/>
+        <w:jc w:val="both"/>
+        <w:rPr>
+          <w:sz w:val="24"/>
+          <w:szCs w:val="24"/>
+          <w:lang w:val="vi-VN"/>
+        </w:rPr>
+      </w:pPr>
+      <w:r>
+        <w:rPr>
+          <w:sz w:val="24"/>
+          <w:szCs w:val="24"/>
+          <w:lang w:val="vi-VN"/>
+        </w:rPr>
+        <w:t>-</w:t>
       </w:r>
       <w:r>
-        <w:t>ệ</w:t>
+        <w:rPr>
+          <w:sz w:val="24"/>
+          <w:szCs w:val="24"/>
+          <w:lang w:val="vi-VN"/>
+        </w:rPr>
+        <w:t xml:space="preserve"> Mô tả: </w:t>
       </w:r>
       <w:r>
-        <w:t>n nào, When xem l</w:t>
+        <w:rPr>
+          <w:sz w:val="24"/>
+          <w:szCs w:val="24"/>
+          <w:lang w:val="vi-VN"/>
+        </w:rPr>
+        <w:t>l</w:t>
       </w:r>
       <w:r>
-        <w:t>ị</w:t>
+        <w:rPr>
+          <w:sz w:val="24"/>
+          <w:szCs w:val="24"/>
+          <w:lang w:val="vi-VN"/>
+        </w:rPr>
+        <w:t>à Ban chủ nhiệm CLB, tôi muốn duyệt xác nhận phiếu đăng ký của sinh viên từ Pending sang Confirmed, để chốt danh sách người tham gia chính thức và cho phép điểm danh khi sự kiện diễn ra.</w:t>
+      </w:r>
+    </w:p>
+    <w:p>
+      <w:pPr>
+        <w:spacing w:after="20"/>
+        <w:ind w:left="288"/>
+        <w:jc w:val="both"/>
+        <w:rPr>
+          <w:sz w:val="24"/>
+          <w:szCs w:val="24"/>
+          <w:lang w:val="vi-VN"/>
+        </w:rPr>
+      </w:pPr>
+      <w:r>
+        <w:rPr>
+          <w:sz w:val="24"/>
+          <w:szCs w:val="24"/>
+          <w:lang w:val="vi-VN"/>
+        </w:rPr>
+        <w:t>-</w:t>
       </w:r>
       <w:r>
-        <w:t>ch s</w:t>
+        <w:rPr>
+          <w:sz w:val="24"/>
+          <w:szCs w:val="24"/>
+          <w:lang w:val="vi-VN"/>
+        </w:rPr>
+        <w:t xml:space="preserve"> Tiêu chí 1 (</w:t>
       </w:r>
       <w:r>
-        <w:t>ử</w:t>
+        <w:rPr>
+          <w:sz w:val="24"/>
+          <w:szCs w:val="24"/>
+          <w:lang w:val="vi-VN"/>
+        </w:rPr>
+        <w:t>h</w:t>
       </w:r>
       <w:r>
-        <w:t>, Then h</w:t>
+        <w:rPr>
+          <w:sz w:val="24"/>
+          <w:szCs w:val="24"/>
+          <w:lang w:val="vi-VN"/>
+        </w:rPr>
+        <w:t xml:space="preserve">ợp lệ): Given phiếu đang ở trạng thái </w:t>
       </w:r>
       <w:r>
-        <w:t>ệ</w:t>
+        <w:rPr>
+          <w:sz w:val="24"/>
+          <w:szCs w:val="24"/>
+          <w:lang w:val="vi-VN"/>
+        </w:rPr>
+        <w:t>Pen</w:t>
       </w:r>
       <w:r>
-        <w:t xml:space="preserve"> th</w:t>
+        <w:rPr>
+          <w:sz w:val="24"/>
+          <w:szCs w:val="24"/>
+          <w:lang w:val="vi-VN"/>
+        </w:rPr>
+        <w:t xml:space="preserve">ding và sự kiện còn chỗ trống, When Ban CLB duyệt phiếu, Then trạng thái chuyển thành Confirmed và đủ điều kiện </w:t>
       </w:r>
       <w:r>
-        <w:t>ố</w:t>
+        <w:rPr>
+          <w:sz w:val="24"/>
+          <w:szCs w:val="24"/>
+          <w:lang w:val="vi-VN"/>
+        </w:rPr>
+        <w:t>check-</w:t>
       </w:r>
       <w:r>
-        <w:t>ng thông báo chưa tham gia và g</w:t>
+        <w:rPr>
+          <w:sz w:val="24"/>
+          <w:szCs w:val="24"/>
+          <w:lang w:val="vi-VN"/>
+        </w:rPr>
+        <w:t>in.</w:t>
+      </w:r>
+    </w:p>
+    <w:p>
+      <w:pPr>
+        <w:spacing w:after="60"/>
+        <w:ind w:left="288"/>
+        <w:jc w:val="both"/>
+        <w:rPr>
+          <w:sz w:val="24"/>
+          <w:szCs w:val="24"/>
+          <w:lang w:val="vi-VN"/>
+        </w:rPr>
+      </w:pPr>
+      <w:r>
+        <w:rPr>
+          <w:sz w:val="24"/>
+          <w:szCs w:val="24"/>
+          <w:lang w:val="vi-VN"/>
+        </w:rPr>
+        <w:t>-</w:t>
       </w:r>
       <w:r>
-        <w:t>ợ</w:t>
+        <w:rPr>
+          <w:sz w:val="24"/>
+          <w:szCs w:val="24"/>
+          <w:lang w:val="vi-VN"/>
+        </w:rPr>
+        <w:t xml:space="preserve"> Tiêu chí 2 (</w:t>
       </w:r>
       <w:r>
-        <w:t>i ý các s</w:t>
+        <w:rPr>
+          <w:sz w:val="24"/>
+          <w:szCs w:val="24"/>
+          <w:lang w:val="vi-VN"/>
+        </w:rPr>
+        <w:t>n</w:t>
       </w:r>
       <w:r>
-        <w:t>ự</w:t>
+        <w:rPr>
+          <w:sz w:val="24"/>
+          <w:szCs w:val="24"/>
+          <w:lang w:val="vi-VN"/>
+        </w:rPr>
+        <w:t>goại lệ/</w:t>
       </w:r>
       <w:r>
-        <w:t xml:space="preserve"> ki</w:t>
+        <w:rPr>
+          <w:sz w:val="24"/>
+          <w:szCs w:val="24"/>
+          <w:lang w:val="vi-VN"/>
+        </w:rPr>
+        <w:t>l</w:t>
       </w:r>
       <w:r>
-        <w:t>ệ</w:t>
+        <w:rPr>
+          <w:sz w:val="24"/>
+          <w:szCs w:val="24"/>
+          <w:lang w:val="vi-VN"/>
+        </w:rPr>
+        <w:t xml:space="preserve">ỗi): Given phiếu đang ở trạng thái Cancelled, When Ban CLB cố gắng duyệt xác nhận, Then hệ thống báo </w:t>
       </w:r>
       <w:r>
-        <w:t>n đang m</w:t>
+        <w:rPr>
+          <w:sz w:val="24"/>
+          <w:szCs w:val="24"/>
+          <w:lang w:val="vi-VN"/>
+        </w:rPr>
+        <w:t>lỗI</w:t>
       </w:r>
       <w:r>
-        <w:t>ở</w:t>
+        <w:rPr>
+          <w:sz w:val="24"/>
+          <w:szCs w:val="24"/>
+          <w:lang w:val="vi-VN"/>
+        </w:rPr>
+        <w:t xml:space="preserve"> </w:t>
       </w:r>
       <w:r>
-        <w:t xml:space="preserve"> còn ch</w:t>
+        <w:rPr>
+          <w:sz w:val="24"/>
+          <w:szCs w:val="24"/>
+          <w:lang w:val="vi-VN"/>
+        </w:rPr>
+        <w:t>“</w:t>
       </w:r>
       <w:r>
-        <w:t>ỗ</w:t>
+        <w:rPr>
+          <w:sz w:val="24"/>
+          <w:szCs w:val="24"/>
+          <w:lang w:val="vi-VN"/>
+        </w:rPr>
+        <w:t xml:space="preserve">Không thể xác nhận phiếu đang </w:t>
       </w:r>
       <w:r>
+        <w:rPr>
+          <w:sz w:val="24"/>
+          <w:szCs w:val="24"/>
+          <w:lang w:val="vi-VN"/>
+        </w:rPr>
+        <w:t>Cancelled”</w:t>
+      </w:r>
+      <w:r>
+        <w:rPr>
+          <w:sz w:val="24"/>
+          <w:szCs w:val="24"/>
+          <w:lang w:val="vi-VN"/>
+        </w:rPr>
         <w:t>.</w:t>
       </w:r>
     </w:p>
     <w:p>
       <w:pPr>
         <w:spacing w:before="80" w:after="20"/>
+        <w:jc w:val="both"/>
+        <w:rPr>
+          <w:b/>
+          <w:bCs/>
+          <w:sz w:val="24"/>
+          <w:szCs w:val="24"/>
+          <w:lang w:val="vi-VN"/>
+        </w:rPr>
       </w:pPr>
       <w:r>
         <w:rPr>
           <w:b/>
-        </w:rPr>
-        <w:t>Story 3 [Ban ch</w:t>
+          <w:bCs/>
+          <w:sz w:val="24"/>
+          <w:szCs w:val="24"/>
+          <w:lang w:val="vi-VN"/>
+        </w:rPr>
+        <w:t xml:space="preserve">Story 4 Ban chủ nhiệm CLB: Cập nhật hình thức tổ chức </w:t>
       </w:r>
       <w:r>
         <w:rPr>
           <w:b/>
-        </w:rPr>
-        <w:t>ủ</w:t>
+          <w:bCs/>
+          <w:sz w:val="24"/>
+          <w:szCs w:val="24"/>
+          <w:lang w:val="vi-VN"/>
+        </w:rPr>
+        <w:t>o</w:t>
       </w:r>
       <w:r>
         <w:rPr>
           <w:b/>
-        </w:rPr>
-        <w:t xml:space="preserve"> nhi</w:t>
+          <w:bCs/>
+          <w:sz w:val="24"/>
+          <w:szCs w:val="24"/>
+          <w:lang w:val="vi-VN"/>
+        </w:rPr>
+        <w:t>nline/</w:t>
       </w:r>
       <w:r>
         <w:rPr>
           <w:b/>
-        </w:rPr>
-        <w:t>ệ</w:t>
+          <w:bCs/>
+          <w:sz w:val="24"/>
+          <w:szCs w:val="24"/>
+          <w:lang w:val="vi-VN"/>
+        </w:rPr>
+        <w:t>o</w:t>
       </w:r>
       <w:r>
         <w:rPr>
           <w:b/>
-        </w:rPr>
-        <w:t>m CLB (Club Board)]: Phê duy</w:t>
-      </w:r>
-      <w:r>
-        <w:rPr>
-          <w:b/>
-        </w:rPr>
-        <w:t>ệ</w:t>
-      </w:r>
-      <w:r>
-        <w:rPr>
-          <w:b/>
-        </w:rPr>
-        <w:t>t xác nh</w:t>
-      </w:r>
-      <w:r>
-        <w:rPr>
-          <w:b/>
-        </w:rPr>
-        <w:t>ậ</w:t>
-      </w:r>
-      <w:r>
-        <w:rPr>
-          <w:b/>
-        </w:rPr>
-        <w:t>n phi</w:t>
-      </w:r>
-      <w:r>
-        <w:rPr>
-          <w:b/>
-        </w:rPr>
-        <w:t>ế</w:t>
-      </w:r>
-      <w:r>
-        <w:rPr>
-          <w:b/>
-        </w:rPr>
-        <w:t>u đăng ký s</w:t>
-      </w:r>
-      <w:r>
-        <w:rPr>
-          <w:b/>
-        </w:rPr>
-        <w:t>ự</w:t>
-      </w:r>
-      <w:r>
-        <w:rPr>
-          <w:b/>
-        </w:rPr>
-        <w:t xml:space="preserve"> ki</w:t>
-      </w:r>
-      <w:r>
-        <w:rPr>
-          <w:b/>
-        </w:rPr>
-        <w:t>ệ</w:t>
-      </w:r>
-      <w:r>
-        <w:rPr>
-          <w:b/>
-        </w:rPr>
-        <w:t>n</w:t>
+          <w:bCs/>
+          <w:sz w:val="24"/>
+          <w:szCs w:val="24"/>
+          <w:lang w:val="vi-VN"/>
+        </w:rPr>
+        <w:t>ffline hoặc sức chứa sự kiện</w:t>
       </w:r>
     </w:p>
     <w:p>
       <w:pPr>
         <w:spacing w:after="20"/>
         <w:ind w:left="288"/>
+        <w:jc w:val="both"/>
+        <w:rPr>
+          <w:sz w:val="24"/>
+          <w:szCs w:val="24"/>
+          <w:lang w:val="vi-VN"/>
+        </w:rPr>
       </w:pPr>
       <w:r>
         <w:rPr>
-          <w:b/>
-        </w:rPr>
-        <w:t>• Mô t</w:t>
+          <w:sz w:val="24"/>
+          <w:szCs w:val="24"/>
+          <w:lang w:val="vi-VN"/>
+        </w:rPr>
+        <w:t>-</w:t>
       </w:r>
       <w:r>
         <w:rPr>
-          <w:b/>
-        </w:rPr>
-        <w:t>ả</w:t>
+          <w:sz w:val="24"/>
+          <w:szCs w:val="24"/>
+          <w:lang w:val="vi-VN"/>
+        </w:rPr>
+        <w:t xml:space="preserve"> Mô tả: </w:t>
       </w:r>
       <w:r>
         <w:rPr>
-          <w:b/>
-        </w:rPr>
-        <w:t xml:space="preserve">: </w:t>
+          <w:sz w:val="24"/>
+          <w:szCs w:val="24"/>
+          <w:lang w:val="vi-VN"/>
+        </w:rPr>
+        <w:t>l</w:t>
       </w:r>
       <w:r>
-        <w:t>Là Ban ch</w:t>
-      </w:r>
-      <w:r>
-        <w:t>ủ</w:t>
-      </w:r>
-      <w:r>
-        <w:t xml:space="preserve"> nhi</w:t>
-      </w:r>
-      <w:r>
-        <w:t>ệ</w:t>
-      </w:r>
-      <w:r>
-        <w:t>m CLB, tôi mu</w:t>
-      </w:r>
-      <w:r>
-        <w:t>ố</w:t>
-      </w:r>
-      <w:r>
-        <w:t>n duy</w:t>
-      </w:r>
-      <w:r>
-        <w:t>ệ</w:t>
-      </w:r>
-      <w:r>
-        <w:t>t xác nh</w:t>
-      </w:r>
-      <w:r>
-        <w:t>ậ</w:t>
-      </w:r>
-      <w:r>
-        <w:t>n phi</w:t>
-      </w:r>
-      <w:r>
-        <w:t>ế</w:t>
-      </w:r>
-      <w:r>
-        <w:t>u đăng ký c</w:t>
-      </w:r>
-      <w:r>
-        <w:t>ủ</w:t>
-      </w:r>
-      <w:r>
-        <w:t>a sinh viên t</w:t>
-      </w:r>
-      <w:r>
-        <w:t>ừ</w:t>
-      </w:r>
-      <w:r>
-        <w:t xml:space="preserve"> Pending sang Confirmed, đ</w:t>
-      </w:r>
-      <w:r>
-        <w:t>ể</w:t>
-      </w:r>
-      <w:r>
-        <w:t xml:space="preserve"> ch</w:t>
-      </w:r>
-      <w:r>
-        <w:t>ố</w:t>
-      </w:r>
-      <w:r>
-        <w:t>t danh sách ngư</w:t>
-      </w:r>
-      <w:r>
-        <w:t>ờ</w:t>
-      </w:r>
-      <w:r>
-        <w:t>i tham gia chính th</w:t>
-      </w:r>
-      <w:r>
-        <w:t>ứ</w:t>
-      </w:r>
-      <w:r>
-        <w:t>c và cho phép đi</w:t>
-      </w:r>
-      <w:r>
-        <w:t>ể</w:t>
-      </w:r>
-      <w:r>
-        <w:t>m danh khi s</w:t>
-      </w:r>
-      <w:r>
-        <w:t>ự</w:t>
-      </w:r>
-      <w:r>
-        <w:t xml:space="preserve"> ki</w:t>
-      </w:r>
-      <w:r>
-        <w:t>ệ</w:t>
-      </w:r>
-      <w:r>
-        <w:t>n di</w:t>
-      </w:r>
-      <w:r>
-        <w:t>ễ</w:t>
-      </w:r>
-      <w:r>
-        <w:t>n ra.</w:t>
+        <w:rPr>
+          <w:sz w:val="24"/>
+          <w:szCs w:val="24"/>
+          <w:lang w:val="vi-VN"/>
+        </w:rPr>
+        <w:t>à Ban chủ nhiệm CLB, tôi muốn cập nhật hình thức tổ chức hoặc điều chỉnh sức chứa sự kiện trước ngày diễn ra, để thích ứng với tình hình thực tế và thông báo kịp thời cho người tham gia.</w:t>
       </w:r>
     </w:p>
     <w:p>
       <w:pPr>
         <w:spacing w:after="20"/>
         <w:ind w:left="288"/>
+        <w:jc w:val="both"/>
+        <w:rPr>
+          <w:sz w:val="24"/>
+          <w:szCs w:val="24"/>
+          <w:lang w:val="vi-VN"/>
+        </w:rPr>
       </w:pPr>
       <w:r>
         <w:rPr>
-          <w:b/>
-        </w:rPr>
-        <w:t>• Tiêu chí 1 (H</w:t>
+          <w:sz w:val="24"/>
+          <w:szCs w:val="24"/>
+          <w:lang w:val="vi-VN"/>
+        </w:rPr>
+        <w:t>-</w:t>
       </w:r>
       <w:r>
         <w:rPr>
-          <w:b/>
-        </w:rPr>
-        <w:t>ợ</w:t>
+          <w:sz w:val="24"/>
+          <w:szCs w:val="24"/>
+          <w:lang w:val="vi-VN"/>
+        </w:rPr>
+        <w:t xml:space="preserve"> Tiêu chí 1 (</w:t>
       </w:r>
       <w:r>
         <w:rPr>
-          <w:b/>
-        </w:rPr>
-        <w:t>p l</w:t>
+          <w:sz w:val="24"/>
+          <w:szCs w:val="24"/>
+          <w:lang w:val="vi-VN"/>
+        </w:rPr>
+        <w:t>h</w:t>
       </w:r>
       <w:r>
         <w:rPr>
-          <w:b/>
-        </w:rPr>
-        <w:t>ệ</w:t>
-      </w:r>
-      <w:r>
-        <w:rPr>
-          <w:b/>
-        </w:rPr>
-        <w:t xml:space="preserve">): </w:t>
-      </w:r>
-      <w:r>
-        <w:t>Given phi</w:t>
-      </w:r>
-      <w:r>
-        <w:t>ế</w:t>
-      </w:r>
-      <w:r>
-        <w:t xml:space="preserve">u đang </w:t>
-      </w:r>
-      <w:r>
-        <w:t>ở</w:t>
-      </w:r>
-      <w:r>
-        <w:t xml:space="preserve"> tr</w:t>
-      </w:r>
-      <w:r>
-        <w:t>ạ</w:t>
-      </w:r>
-      <w:r>
-        <w:t>ng thái Pending và s</w:t>
-      </w:r>
-      <w:r>
-        <w:t>ự</w:t>
-      </w:r>
-      <w:r>
-        <w:t xml:space="preserve"> ki</w:t>
-      </w:r>
-      <w:r>
-        <w:t>ệ</w:t>
-      </w:r>
-      <w:r>
-        <w:t>n còn ch</w:t>
-      </w:r>
-      <w:r>
-        <w:t>ỗ</w:t>
-      </w:r>
-      <w:r>
-        <w:t xml:space="preserve"> tr</w:t>
-      </w:r>
-      <w:r>
-        <w:t>ố</w:t>
-      </w:r>
-      <w:r>
-        <w:t>ng, When Ban CLB duy</w:t>
-      </w:r>
-      <w:r>
-        <w:t>ệ</w:t>
-      </w:r>
-      <w:r>
-        <w:t>t phi</w:t>
-      </w:r>
-      <w:r>
-        <w:t>ế</w:t>
-      </w:r>
-      <w:r>
-        <w:t>u, Then tr</w:t>
-      </w:r>
-      <w:r>
-        <w:t>ạ</w:t>
-      </w:r>
-      <w:r>
-        <w:t>ng thái chuy</w:t>
-      </w:r>
-      <w:r>
-        <w:t>ể</w:t>
-      </w:r>
-      <w:r>
-        <w:t>n thành Confirmed và đ</w:t>
-      </w:r>
-      <w:r>
-        <w:t>ủ</w:t>
-      </w:r>
-      <w:r>
-        <w:t xml:space="preserve"> đi</w:t>
-      </w:r>
-      <w:r>
-        <w:t>ề</w:t>
-      </w:r>
-      <w:r>
-        <w:t>u ki</w:t>
-      </w:r>
-      <w:r>
-        <w:t>ệ</w:t>
-      </w:r>
-      <w:r>
-        <w:t>n check-in.</w:t>
+          <w:sz w:val="24"/>
+          <w:szCs w:val="24"/>
+          <w:lang w:val="vi-VN"/>
+        </w:rPr>
+        <w:t>ợp lệ): Given sự kiện chưa diễn ra, When Ban CLB cập nhật hình thức tổ chức (chuyển sang trực tuyến), Then thuộc tính IsOnline được lưu và hệ thống gửi thông báo tới sinh viên đã đăng ký.</w:t>
       </w:r>
     </w:p>
     <w:p>
       <w:pPr>
         <w:spacing w:after="60"/>
         <w:ind w:left="288"/>
+        <w:jc w:val="both"/>
+        <w:rPr>
+          <w:sz w:val="24"/>
+          <w:szCs w:val="24"/>
+          <w:lang w:val="vi-VN"/>
+        </w:rPr>
       </w:pPr>
       <w:r>
         <w:rPr>
-          <w:b/>
-        </w:rPr>
-        <w:t>• Tiêu chí 2 (Ngo</w:t>
+          <w:sz w:val="24"/>
+          <w:szCs w:val="24"/>
+          <w:lang w:val="vi-VN"/>
+        </w:rPr>
+        <w:t>-</w:t>
       </w:r>
       <w:r>
         <w:rPr>
-          <w:b/>
-        </w:rPr>
-        <w:t>ạ</w:t>
+          <w:sz w:val="24"/>
+          <w:szCs w:val="24"/>
+          <w:lang w:val="vi-VN"/>
+        </w:rPr>
+        <w:t xml:space="preserve"> Tiêu chí 2 (</w:t>
       </w:r>
       <w:r>
         <w:rPr>
-          <w:b/>
-        </w:rPr>
-        <w:t>i l</w:t>
+          <w:sz w:val="24"/>
+          <w:szCs w:val="24"/>
+          <w:lang w:val="vi-VN"/>
+        </w:rPr>
+        <w:t>n</w:t>
       </w:r>
       <w:r>
         <w:rPr>
-          <w:b/>
-        </w:rPr>
-        <w:t>ệ</w:t>
+          <w:sz w:val="24"/>
+          <w:szCs w:val="24"/>
+          <w:lang w:val="vi-VN"/>
+        </w:rPr>
+        <w:t>goại lệ/</w:t>
       </w:r>
       <w:r>
         <w:rPr>
-          <w:b/>
-        </w:rPr>
-        <w:t>/L</w:t>
+          <w:sz w:val="24"/>
+          <w:szCs w:val="24"/>
+          <w:lang w:val="vi-VN"/>
+        </w:rPr>
+        <w:t>l</w:t>
       </w:r>
       <w:r>
         <w:rPr>
-          <w:b/>
-        </w:rPr>
-        <w:t>ỗ</w:t>
+          <w:sz w:val="24"/>
+          <w:szCs w:val="24"/>
+          <w:lang w:val="vi-VN"/>
+        </w:rPr>
+        <w:t xml:space="preserve">ỗi): Given sự kiện đã duyệt 40 người, When Ban CLB hạ sức chứa xuống 30, Then hệ thống từ chối và báo lỗi </w:t>
       </w:r>
       <w:r>
         <w:rPr>
-          <w:b/>
-        </w:rPr>
-        <w:t xml:space="preserve">i): </w:t>
+          <w:sz w:val="24"/>
+          <w:szCs w:val="24"/>
+          <w:lang w:val="vi-VN"/>
+        </w:rPr>
+        <w:t>“s</w:t>
       </w:r>
       <w:r>
-        <w:t>Given phi</w:t>
+        <w:rPr>
+          <w:sz w:val="24"/>
+          <w:szCs w:val="24"/>
+          <w:lang w:val="vi-VN"/>
+        </w:rPr>
+        <w:t xml:space="preserve">ức chứa mới nhỏ hơn số lượng đã </w:t>
       </w:r>
       <w:r>
-        <w:t>ế</w:t>
+        <w:rPr>
+          <w:sz w:val="24"/>
+          <w:szCs w:val="24"/>
+          <w:lang w:val="vi-VN"/>
+        </w:rPr>
+        <w:t>duyệt”</w:t>
       </w:r>
       <w:r>
-        <w:t xml:space="preserve">u đang </w:t>
-      </w:r>
-      <w:r>
-        <w:t>ở</w:t>
-      </w:r>
-      <w:r>
-        <w:t xml:space="preserve"> tr</w:t>
-      </w:r>
-      <w:r>
-        <w:t>ạ</w:t>
-      </w:r>
-      <w:r>
-        <w:t>ng thái Cancelled, When Ban CLB c</w:t>
-      </w:r>
-      <w:r>
-        <w:t>ố</w:t>
-      </w:r>
-      <w:r>
-        <w:t xml:space="preserve"> g</w:t>
-      </w:r>
-      <w:r>
-        <w:t>ắ</w:t>
-      </w:r>
-      <w:r>
-        <w:t>ng duy</w:t>
-      </w:r>
-      <w:r>
-        <w:t>ệ</w:t>
-      </w:r>
-      <w:r>
-        <w:t>t xác nh</w:t>
-      </w:r>
-      <w:r>
-        <w:t>ậ</w:t>
-      </w:r>
-      <w:r>
-        <w:t>n, Then h</w:t>
-      </w:r>
-      <w:r>
-        <w:t>ệ</w:t>
-      </w:r>
-      <w:r>
-        <w:t xml:space="preserve"> th</w:t>
-      </w:r>
-      <w:r>
-        <w:t>ố</w:t>
-      </w:r>
-      <w:r>
-        <w:t>ng báo l</w:t>
-      </w:r>
-      <w:r>
-        <w:t>ỗ</w:t>
-      </w:r>
-      <w:r>
-        <w:t>i InvalidOperationException ("Không th</w:t>
-      </w:r>
-      <w:r>
-        <w:t>ể</w:t>
-      </w:r>
-      <w:r>
-        <w:t xml:space="preserve"> xác nh</w:t>
-      </w:r>
-      <w:r>
-        <w:t>ậ</w:t>
-      </w:r>
-      <w:r>
-        <w:t>n phi</w:t>
-      </w:r>
-      <w:r>
-        <w:t>ế</w:t>
-      </w:r>
-      <w:r>
-        <w:t>u đang Cancelled").</w:t>
+        <w:rPr>
+          <w:sz w:val="24"/>
+          <w:szCs w:val="24"/>
+          <w:lang w:val="vi-VN"/>
+        </w:rPr>
+        <w:t>.</w:t>
       </w:r>
     </w:p>
     <w:p>
       <w:pPr>
         <w:spacing w:before="80" w:after="20"/>
+        <w:jc w:val="both"/>
+        <w:rPr>
+          <w:b/>
+          <w:bCs/>
+          <w:sz w:val="24"/>
+          <w:szCs w:val="24"/>
+          <w:lang w:val="vi-VN"/>
+        </w:rPr>
       </w:pPr>
       <w:r>
         <w:rPr>
           <w:b/>
-        </w:rPr>
-        <w:t>Story 4 [Ban ch</w:t>
+          <w:bCs/>
+          <w:sz w:val="24"/>
+          <w:szCs w:val="24"/>
+          <w:lang w:val="vi-VN"/>
+        </w:rPr>
+        <w:t xml:space="preserve">Story 5 </w:t>
       </w:r>
       <w:r>
         <w:rPr>
           <w:b/>
-        </w:rPr>
-        <w:t>ủ</w:t>
+          <w:bCs/>
+          <w:sz w:val="24"/>
+          <w:szCs w:val="24"/>
+          <w:lang w:val="vi-VN"/>
+        </w:rPr>
+        <w:t>Admin</w:t>
       </w:r>
       <w:r>
         <w:rPr>
           <w:b/>
-        </w:rPr>
-        <w:t xml:space="preserve"> nhi</w:t>
+          <w:bCs/>
+          <w:sz w:val="24"/>
+          <w:szCs w:val="24"/>
+          <w:lang w:val="vi-VN"/>
+        </w:rPr>
+        <w:t xml:space="preserve">: </w:t>
       </w:r>
       <w:r>
         <w:rPr>
           <w:b/>
-        </w:rPr>
-        <w:t>ệ</w:t>
+          <w:bCs/>
+          <w:sz w:val="24"/>
+          <w:szCs w:val="24"/>
+          <w:lang w:val="vi-VN"/>
+        </w:rPr>
+        <w:t>t</w:t>
       </w:r>
       <w:r>
         <w:rPr>
           <w:b/>
-        </w:rPr>
-        <w:t>m CLB (Club Board)]: C</w:t>
+          <w:bCs/>
+          <w:sz w:val="24"/>
+          <w:szCs w:val="24"/>
+          <w:lang w:val="vi-VN"/>
+        </w:rPr>
+        <w:t xml:space="preserve">hẩm định và khởi tạo </w:t>
       </w:r>
       <w:r>
         <w:rPr>
           <w:b/>
-        </w:rPr>
-        <w:t>ậ</w:t>
+          <w:bCs/>
+          <w:sz w:val="24"/>
+          <w:szCs w:val="24"/>
+          <w:lang w:val="vi-VN"/>
+        </w:rPr>
+        <w:t>c</w:t>
       </w:r>
       <w:r>
         <w:rPr>
           <w:b/>
-        </w:rPr>
-        <w:t>p nh</w:t>
-      </w:r>
-      <w:r>
-        <w:rPr>
-          <w:b/>
-        </w:rPr>
-        <w:t>ậ</w:t>
-      </w:r>
-      <w:r>
-        <w:rPr>
-          <w:b/>
-        </w:rPr>
-        <w:t>t hình th</w:t>
-      </w:r>
-      <w:r>
-        <w:rPr>
-          <w:b/>
-        </w:rPr>
-        <w:t>ứ</w:t>
-      </w:r>
-      <w:r>
-        <w:rPr>
-          <w:b/>
-        </w:rPr>
-        <w:t>c t</w:t>
-      </w:r>
-      <w:r>
-        <w:rPr>
-          <w:b/>
-        </w:rPr>
-        <w:t>ổ</w:t>
-      </w:r>
-      <w:r>
-        <w:rPr>
-          <w:b/>
-        </w:rPr>
-        <w:t xml:space="preserve"> ch</w:t>
-      </w:r>
-      <w:r>
-        <w:rPr>
-          <w:b/>
-        </w:rPr>
-        <w:t>ứ</w:t>
-      </w:r>
-      <w:r>
-        <w:rPr>
-          <w:b/>
-        </w:rPr>
-        <w:t>c (Online/Offline) ho</w:t>
-      </w:r>
-      <w:r>
-        <w:rPr>
-          <w:b/>
-        </w:rPr>
-        <w:t>ặ</w:t>
-      </w:r>
-      <w:r>
-        <w:rPr>
-          <w:b/>
-        </w:rPr>
-        <w:t>c s</w:t>
-      </w:r>
-      <w:r>
-        <w:rPr>
-          <w:b/>
-        </w:rPr>
-        <w:t>ứ</w:t>
-      </w:r>
-      <w:r>
-        <w:rPr>
-          <w:b/>
-        </w:rPr>
-        <w:t>c ch</w:t>
-      </w:r>
-      <w:r>
-        <w:rPr>
-          <w:b/>
-        </w:rPr>
-        <w:t>ứ</w:t>
-      </w:r>
-      <w:r>
-        <w:rPr>
-          <w:b/>
-        </w:rPr>
-        <w:t>a s</w:t>
-      </w:r>
-      <w:r>
-        <w:rPr>
-          <w:b/>
-        </w:rPr>
-        <w:t>ự</w:t>
-      </w:r>
-      <w:r>
-        <w:rPr>
-          <w:b/>
-        </w:rPr>
-        <w:t xml:space="preserve"> ki</w:t>
-      </w:r>
-      <w:r>
-        <w:rPr>
-          <w:b/>
-        </w:rPr>
-        <w:t>ệ</w:t>
-      </w:r>
-      <w:r>
-        <w:rPr>
-          <w:b/>
-        </w:rPr>
-        <w:t>n</w:t>
+          <w:bCs/>
+          <w:sz w:val="24"/>
+          <w:szCs w:val="24"/>
+          <w:lang w:val="vi-VN"/>
+        </w:rPr>
+        <w:t>âu lạc bộ mới</w:t>
       </w:r>
     </w:p>
     <w:p>
       <w:pPr>
         <w:spacing w:after="20"/>
         <w:ind w:left="288"/>
+        <w:jc w:val="both"/>
+        <w:rPr>
+          <w:sz w:val="24"/>
+          <w:szCs w:val="24"/>
+          <w:lang w:val="vi-VN"/>
+        </w:rPr>
       </w:pPr>
       <w:r>
         <w:rPr>
-          <w:b/>
-        </w:rPr>
-        <w:t>• Mô t</w:t>
+          <w:sz w:val="24"/>
+          <w:szCs w:val="24"/>
+          <w:lang w:val="vi-VN"/>
+        </w:rPr>
+        <w:t>-</w:t>
       </w:r>
       <w:r>
         <w:rPr>
-          <w:b/>
-        </w:rPr>
-        <w:t>ả</w:t>
+          <w:sz w:val="24"/>
+          <w:szCs w:val="24"/>
+          <w:lang w:val="vi-VN"/>
+        </w:rPr>
+        <w:t xml:space="preserve"> Mô tả: </w:t>
       </w:r>
       <w:r>
         <w:rPr>
-          <w:b/>
-        </w:rPr>
-        <w:t xml:space="preserve">: </w:t>
+          <w:sz w:val="24"/>
+          <w:szCs w:val="24"/>
+          <w:lang w:val="vi-VN"/>
+        </w:rPr>
+        <w:t>l</w:t>
       </w:r>
       <w:r>
-        <w:t>Là Ban ch</w:t>
+        <w:rPr>
+          <w:sz w:val="24"/>
+          <w:szCs w:val="24"/>
+          <w:lang w:val="vi-VN"/>
+        </w:rPr>
+        <w:t xml:space="preserve">à Admin hệ thống, tôi muốn thẩm định và khởi tạo </w:t>
       </w:r>
       <w:r>
-        <w:t>ủ</w:t>
+        <w:rPr>
+          <w:sz w:val="24"/>
+          <w:szCs w:val="24"/>
+          <w:lang w:val="vi-VN"/>
+        </w:rPr>
+        <w:t>c</w:t>
       </w:r>
       <w:r>
-        <w:t xml:space="preserve"> nhi</w:t>
-      </w:r>
-      <w:r>
-        <w:t>ệ</w:t>
-      </w:r>
-      <w:r>
-        <w:t>m CLB, tôi mu</w:t>
-      </w:r>
-      <w:r>
-        <w:t>ố</w:t>
-      </w:r>
-      <w:r>
-        <w:t>n c</w:t>
-      </w:r>
-      <w:r>
-        <w:t>ậ</w:t>
-      </w:r>
-      <w:r>
-        <w:t>p nh</w:t>
-      </w:r>
-      <w:r>
-        <w:t>ậ</w:t>
-      </w:r>
-      <w:r>
-        <w:t>t hình th</w:t>
-      </w:r>
-      <w:r>
-        <w:t>ứ</w:t>
-      </w:r>
-      <w:r>
-        <w:t>c t</w:t>
-      </w:r>
-      <w:r>
-        <w:t>ổ</w:t>
-      </w:r>
-      <w:r>
-        <w:t xml:space="preserve"> ch</w:t>
-      </w:r>
-      <w:r>
-        <w:t>ứ</w:t>
-      </w:r>
-      <w:r>
-        <w:t>c ho</w:t>
-      </w:r>
-      <w:r>
-        <w:t>ặ</w:t>
-      </w:r>
-      <w:r>
-        <w:t>c đi</w:t>
-      </w:r>
-      <w:r>
-        <w:t>ề</w:t>
-      </w:r>
-      <w:r>
-        <w:t>u ch</w:t>
-      </w:r>
-      <w:r>
-        <w:t>ỉ</w:t>
-      </w:r>
-      <w:r>
-        <w:t>nh s</w:t>
-      </w:r>
-      <w:r>
-        <w:t>ứ</w:t>
-      </w:r>
-      <w:r>
-        <w:t>c ch</w:t>
-      </w:r>
-      <w:r>
-        <w:t>ứ</w:t>
-      </w:r>
-      <w:r>
-        <w:t>a s</w:t>
-      </w:r>
-      <w:r>
-        <w:t>ự</w:t>
-      </w:r>
-      <w:r>
-        <w:t xml:space="preserve"> ki</w:t>
-      </w:r>
-      <w:r>
-        <w:t>ệ</w:t>
-      </w:r>
-      <w:r>
-        <w:t>n trư</w:t>
-      </w:r>
-      <w:r>
-        <w:t>ớ</w:t>
-      </w:r>
-      <w:r>
-        <w:t>c ngày di</w:t>
-      </w:r>
-      <w:r>
-        <w:t>ễ</w:t>
-      </w:r>
-      <w:r>
-        <w:t>n ra, đ</w:t>
-      </w:r>
-      <w:r>
-        <w:t>ể</w:t>
-      </w:r>
-      <w:r>
-        <w:t xml:space="preserve"> thích </w:t>
-      </w:r>
-      <w:r>
-        <w:t>ứ</w:t>
-      </w:r>
-      <w:r>
-        <w:t>ng v</w:t>
-      </w:r>
-      <w:r>
-        <w:t>ớ</w:t>
-      </w:r>
-      <w:r>
-        <w:t>i tình hình th</w:t>
-      </w:r>
-      <w:r>
-        <w:t>ự</w:t>
-      </w:r>
-      <w:r>
-        <w:t>c t</w:t>
-      </w:r>
-      <w:r>
-        <w:t>ế</w:t>
-      </w:r>
-      <w:r>
-        <w:t xml:space="preserve"> và thông báo k</w:t>
-      </w:r>
-      <w:r>
-        <w:t>ị</w:t>
-      </w:r>
-      <w:r>
-        <w:t>p th</w:t>
-      </w:r>
-      <w:r>
-        <w:t>ờ</w:t>
-      </w:r>
-      <w:r>
-        <w:t>i cho ngư</w:t>
-      </w:r>
-      <w:r>
-        <w:t>ờ</w:t>
-      </w:r>
-      <w:r>
-        <w:t>i tham gia.</w:t>
+        <w:rPr>
+          <w:sz w:val="24"/>
+          <w:szCs w:val="24"/>
+          <w:lang w:val="vi-VN"/>
+        </w:rPr>
+        <w:t>âu lạc bộ mới qua phương thức Club.Create(), để quản lý danh mục các CLB hoạt động hợp lệ trong trường.</w:t>
       </w:r>
     </w:p>
     <w:p>
       <w:pPr>
         <w:spacing w:after="20"/>
         <w:ind w:left="288"/>
+        <w:jc w:val="both"/>
+        <w:rPr>
+          <w:sz w:val="24"/>
+          <w:szCs w:val="24"/>
+          <w:lang w:val="vi-VN"/>
+        </w:rPr>
       </w:pPr>
       <w:r>
         <w:rPr>
-          <w:b/>
-        </w:rPr>
-        <w:t>• Tiêu chí 1 (H</w:t>
+          <w:sz w:val="24"/>
+          <w:szCs w:val="24"/>
+          <w:lang w:val="vi-VN"/>
+        </w:rPr>
+        <w:t>-</w:t>
       </w:r>
       <w:r>
         <w:rPr>
-          <w:b/>
-        </w:rPr>
-        <w:t>ợ</w:t>
+          <w:sz w:val="24"/>
+          <w:szCs w:val="24"/>
+          <w:lang w:val="vi-VN"/>
+        </w:rPr>
+        <w:t xml:space="preserve"> Tiêu chí 1 (</w:t>
       </w:r>
       <w:r>
         <w:rPr>
-          <w:b/>
-        </w:rPr>
-        <w:t>p l</w:t>
+          <w:sz w:val="24"/>
+          <w:szCs w:val="24"/>
+          <w:lang w:val="vi-VN"/>
+        </w:rPr>
+        <w:t>h</w:t>
       </w:r>
       <w:r>
         <w:rPr>
-          <w:b/>
-        </w:rPr>
-        <w:t>ệ</w:t>
-      </w:r>
-      <w:r>
-        <w:rPr>
-          <w:b/>
-        </w:rPr>
-        <w:t xml:space="preserve">): </w:t>
-      </w:r>
-      <w:r>
-        <w:t>Given s</w:t>
-      </w:r>
-      <w:r>
-        <w:t>ự</w:t>
-      </w:r>
-      <w:r>
-        <w:t xml:space="preserve"> ki</w:t>
-      </w:r>
-      <w:r>
-        <w:t>ệ</w:t>
-      </w:r>
-      <w:r>
-        <w:t>n chưa di</w:t>
-      </w:r>
-      <w:r>
-        <w:t>ễ</w:t>
-      </w:r>
-      <w:r>
-        <w:t>n ra, When Ban CLB c</w:t>
-      </w:r>
-      <w:r>
-        <w:t>ậ</w:t>
-      </w:r>
-      <w:r>
-        <w:t>p nh</w:t>
-      </w:r>
-      <w:r>
-        <w:t>ậ</w:t>
-      </w:r>
-      <w:r>
-        <w:t>t hình th</w:t>
-      </w:r>
-      <w:r>
-        <w:t>ứ</w:t>
-      </w:r>
-      <w:r>
-        <w:t>c t</w:t>
-      </w:r>
-      <w:r>
-        <w:t>ổ</w:t>
-      </w:r>
-      <w:r>
-        <w:t xml:space="preserve"> ch</w:t>
-      </w:r>
-      <w:r>
-        <w:t>ứ</w:t>
-      </w:r>
-      <w:r>
-        <w:t>c (chuy</w:t>
-      </w:r>
-      <w:r>
-        <w:t>ể</w:t>
-      </w:r>
-      <w:r>
-        <w:t>n sang tr</w:t>
-      </w:r>
-      <w:r>
-        <w:t>ự</w:t>
-      </w:r>
-      <w:r>
-        <w:t>c tuy</w:t>
-      </w:r>
-      <w:r>
-        <w:t>ế</w:t>
-      </w:r>
-      <w:r>
-        <w:t>n), Then thu</w:t>
-      </w:r>
-      <w:r>
-        <w:t>ộ</w:t>
-      </w:r>
-      <w:r>
-        <w:t>c tính IsOnline đư</w:t>
-      </w:r>
-      <w:r>
-        <w:t>ợ</w:t>
-      </w:r>
-      <w:r>
-        <w:t>c lưu và h</w:t>
-      </w:r>
-      <w:r>
-        <w:t>ệ</w:t>
-      </w:r>
-      <w:r>
-        <w:t xml:space="preserve"> th</w:t>
-      </w:r>
-      <w:r>
-        <w:t>ố</w:t>
-      </w:r>
-      <w:r>
-        <w:t>ng g</w:t>
-      </w:r>
-      <w:r>
-        <w:t>ử</w:t>
-      </w:r>
-      <w:r>
-        <w:t>i thông báo t</w:t>
-      </w:r>
-      <w:r>
-        <w:t>ớ</w:t>
-      </w:r>
-      <w:r>
-        <w:t>i sinh viên đã đăng ký.</w:t>
+          <w:sz w:val="24"/>
+          <w:szCs w:val="24"/>
+          <w:lang w:val="vi-VN"/>
+        </w:rPr>
+        <w:t>ợp lệ): Given thông tin tên CLB hợp lệ (không rỗng, có mô tả), When Admin tạo CLB, Then đối tượng Club được tạo thành công với mã định danh Id và thời gian tạo mới.</w:t>
       </w:r>
     </w:p>
     <w:p>
       <w:pPr>
         <w:spacing w:after="60"/>
         <w:ind w:left="288"/>
+        <w:jc w:val="both"/>
+        <w:rPr>
+          <w:sz w:val="24"/>
+          <w:szCs w:val="24"/>
+          <w:lang w:val="vi-VN"/>
+        </w:rPr>
       </w:pPr>
       <w:r>
         <w:rPr>
-          <w:b/>
-        </w:rPr>
-        <w:t>• Tiêu chí 2 (Ngo</w:t>
+          <w:sz w:val="24"/>
+          <w:szCs w:val="24"/>
+          <w:lang w:val="vi-VN"/>
+        </w:rPr>
+        <w:t>-</w:t>
       </w:r>
       <w:r>
         <w:rPr>
-          <w:b/>
-        </w:rPr>
-        <w:t>ạ</w:t>
+          <w:sz w:val="24"/>
+          <w:szCs w:val="24"/>
+          <w:lang w:val="vi-VN"/>
+        </w:rPr>
+        <w:t xml:space="preserve"> Tiêu chí 2 (</w:t>
       </w:r>
       <w:r>
         <w:rPr>
-          <w:b/>
-        </w:rPr>
-        <w:t>i l</w:t>
+          <w:sz w:val="24"/>
+          <w:szCs w:val="24"/>
+          <w:lang w:val="vi-VN"/>
+        </w:rPr>
+        <w:t>n</w:t>
       </w:r>
       <w:r>
         <w:rPr>
-          <w:b/>
-        </w:rPr>
-        <w:t>ệ</w:t>
+          <w:sz w:val="24"/>
+          <w:szCs w:val="24"/>
+          <w:lang w:val="vi-VN"/>
+        </w:rPr>
+        <w:t>goại lệ/</w:t>
       </w:r>
       <w:r>
         <w:rPr>
-          <w:b/>
-        </w:rPr>
-        <w:t>/L</w:t>
+          <w:sz w:val="24"/>
+          <w:szCs w:val="24"/>
+          <w:lang w:val="vi-VN"/>
+        </w:rPr>
+        <w:t>l</w:t>
       </w:r>
       <w:r>
         <w:rPr>
-          <w:b/>
-        </w:rPr>
-        <w:t>ỗ</w:t>
-      </w:r>
-      <w:r>
-        <w:rPr>
-          <w:b/>
-        </w:rPr>
-        <w:t xml:space="preserve">i): </w:t>
-      </w:r>
-      <w:r>
-        <w:t>Given s</w:t>
-      </w:r>
-      <w:r>
-        <w:t>ự</w:t>
-      </w:r>
-      <w:r>
-        <w:t xml:space="preserve"> ki</w:t>
-      </w:r>
-      <w:r>
-        <w:t>ệ</w:t>
-      </w:r>
-      <w:r>
-        <w:t>n đã duy</w:t>
-      </w:r>
-      <w:r>
-        <w:t>ệ</w:t>
-      </w:r>
-      <w:r>
-        <w:t>t 40 ngư</w:t>
-      </w:r>
-      <w:r>
-        <w:t>ờ</w:t>
-      </w:r>
-      <w:r>
-        <w:t>i, When Ban CLB h</w:t>
-      </w:r>
-      <w:r>
-        <w:t>ạ</w:t>
-      </w:r>
-      <w:r>
-        <w:t xml:space="preserve"> s</w:t>
-      </w:r>
-      <w:r>
-        <w:t>ứ</w:t>
-      </w:r>
-      <w:r>
-        <w:t>c ch</w:t>
-      </w:r>
-      <w:r>
-        <w:t>ứ</w:t>
-      </w:r>
-      <w:r>
-        <w:t>a xu</w:t>
-      </w:r>
-      <w:r>
-        <w:t>ố</w:t>
-      </w:r>
-      <w:r>
-        <w:t>ng 30, Then h</w:t>
-      </w:r>
-      <w:r>
-        <w:t>ệ</w:t>
-      </w:r>
-      <w:r>
-        <w:t xml:space="preserve"> th</w:t>
-      </w:r>
-      <w:r>
-        <w:t>ố</w:t>
-      </w:r>
-      <w:r>
-        <w:t>ng t</w:t>
-      </w:r>
-      <w:r>
-        <w:t>ừ</w:t>
-      </w:r>
-      <w:r>
-        <w:t xml:space="preserve"> ch</w:t>
-      </w:r>
-      <w:r>
-        <w:t>ố</w:t>
-      </w:r>
-      <w:r>
-        <w:t>i và báo l</w:t>
-      </w:r>
-      <w:r>
-        <w:t>ỗ</w:t>
-      </w:r>
-      <w:r>
-        <w:t>i ArgumentException ("S</w:t>
-      </w:r>
-      <w:r>
-        <w:t>ứ</w:t>
-      </w:r>
-      <w:r>
-        <w:t>c ch</w:t>
-      </w:r>
-      <w:r>
-        <w:t>ứ</w:t>
-      </w:r>
-      <w:r>
-        <w:t>a m</w:t>
-      </w:r>
-      <w:r>
-        <w:t>ớ</w:t>
-      </w:r>
-      <w:r>
-        <w:t>i nh</w:t>
-      </w:r>
-      <w:r>
-        <w:t>ỏ</w:t>
-      </w:r>
-      <w:r>
-        <w:t xml:space="preserve"> hơn s</w:t>
-      </w:r>
-      <w:r>
-        <w:t>ố</w:t>
-      </w:r>
-      <w:r>
-        <w:t xml:space="preserve"> lư</w:t>
-      </w:r>
-      <w:r>
-        <w:t>ợ</w:t>
-      </w:r>
-      <w:r>
-        <w:t>ng đã duy</w:t>
-      </w:r>
-      <w:r>
-        <w:t>ệ</w:t>
-      </w:r>
-      <w:r>
-        <w:t>t").</w:t>
-      </w:r>
-    </w:p>
-    <w:p>
-      <w:pPr>
-        <w:spacing w:before="80" w:after="20"/>
-      </w:pPr>
-      <w:r>
-        <w:rPr>
-          <w:b/>
-        </w:rPr>
-        <w:t>Story 5 [Qu</w:t>
-      </w:r>
-      <w:r>
-        <w:rPr>
-          <w:b/>
-        </w:rPr>
-        <w:t>ả</w:t>
-      </w:r>
-      <w:r>
-        <w:rPr>
-          <w:b/>
-        </w:rPr>
-        <w:t>n tr</w:t>
-      </w:r>
-      <w:r>
-        <w:rPr>
-          <w:b/>
-        </w:rPr>
-        <w:t>ị</w:t>
-      </w:r>
-      <w:r>
-        <w:rPr>
-          <w:b/>
-        </w:rPr>
-        <w:t xml:space="preserve"> viên (Admin)]: Th</w:t>
-      </w:r>
-      <w:r>
-        <w:rPr>
-          <w:b/>
-        </w:rPr>
-        <w:t>ẩ</w:t>
-      </w:r>
-      <w:r>
-        <w:rPr>
-          <w:b/>
-        </w:rPr>
-        <w:t>m đ</w:t>
-      </w:r>
-      <w:r>
-        <w:rPr>
-          <w:b/>
-        </w:rPr>
-        <w:t>ị</w:t>
-      </w:r>
-      <w:r>
-        <w:rPr>
-          <w:b/>
-        </w:rPr>
-        <w:t>nh và kh</w:t>
-      </w:r>
-      <w:r>
-        <w:rPr>
-          <w:b/>
-        </w:rPr>
-        <w:t>ở</w:t>
-      </w:r>
-      <w:r>
-        <w:rPr>
-          <w:b/>
-        </w:rPr>
-        <w:t>i t</w:t>
-      </w:r>
-      <w:r>
-        <w:rPr>
-          <w:b/>
-        </w:rPr>
-        <w:t>ạ</w:t>
-      </w:r>
-      <w:r>
-        <w:rPr>
-          <w:b/>
-        </w:rPr>
-        <w:t>o Câu l</w:t>
-      </w:r>
-      <w:r>
-        <w:rPr>
-          <w:b/>
-        </w:rPr>
-        <w:t>ạ</w:t>
-      </w:r>
-      <w:r>
-        <w:rPr>
-          <w:b/>
-        </w:rPr>
-        <w:t>c b</w:t>
-      </w:r>
-      <w:r>
-        <w:rPr>
-          <w:b/>
-        </w:rPr>
-        <w:t>ộ</w:t>
-      </w:r>
-      <w:r>
-        <w:rPr>
-          <w:b/>
-        </w:rPr>
-        <w:t xml:space="preserve"> m</w:t>
-      </w:r>
-      <w:r>
-        <w:rPr>
-          <w:b/>
-        </w:rPr>
-        <w:t>ớ</w:t>
-      </w:r>
-      <w:r>
-        <w:rPr>
-          <w:b/>
-        </w:rPr>
-        <w:t>i</w:t>
-      </w:r>
-    </w:p>
-    <w:p>
-      <w:pPr>
-        <w:spacing w:after="20"/>
-        <w:ind w:left="288"/>
-      </w:pPr>
-      <w:r>
-        <w:rPr>
-          <w:b/>
-        </w:rPr>
-        <w:t>• Mô t</w:t>
-      </w:r>
-      <w:r>
-        <w:rPr>
-          <w:b/>
-        </w:rPr>
-        <w:t>ả</w:t>
-      </w:r>
-      <w:r>
-        <w:rPr>
-          <w:b/>
-        </w:rPr>
-        <w:t xml:space="preserve">: </w:t>
-      </w:r>
-      <w:r>
-        <w:t>Là Admin h</w:t>
-      </w:r>
-      <w:r>
-        <w:t>ệ</w:t>
-      </w:r>
-      <w:r>
-        <w:t xml:space="preserve"> th</w:t>
-      </w:r>
-      <w:r>
-        <w:t>ố</w:t>
-      </w:r>
-      <w:r>
-        <w:t>ng, tôi mu</w:t>
-      </w:r>
-      <w:r>
-        <w:t>ố</w:t>
-      </w:r>
-      <w:r>
-        <w:t>n th</w:t>
-      </w:r>
-      <w:r>
-        <w:t>ẩ</w:t>
-      </w:r>
-      <w:r>
-        <w:t>m đ</w:t>
-      </w:r>
-      <w:r>
-        <w:t>ị</w:t>
-      </w:r>
-      <w:r>
-        <w:t>nh và kh</w:t>
-      </w:r>
-      <w:r>
-        <w:t>ở</w:t>
-      </w:r>
-      <w:r>
-        <w:t>i t</w:t>
-      </w:r>
-      <w:r>
-        <w:t>ạ</w:t>
-      </w:r>
-      <w:r>
-        <w:t>o Câu l</w:t>
-      </w:r>
-      <w:r>
-        <w:t>ạ</w:t>
-      </w:r>
-      <w:r>
-        <w:t>c b</w:t>
-      </w:r>
-      <w:r>
-        <w:t>ộ</w:t>
-      </w:r>
-      <w:r>
-        <w:t xml:space="preserve"> m</w:t>
-      </w:r>
-      <w:r>
-        <w:t>ớ</w:t>
-      </w:r>
-      <w:r>
-        <w:t>i qua phương th</w:t>
-      </w:r>
-      <w:r>
-        <w:t>ứ</w:t>
-      </w:r>
-      <w:r>
-        <w:t>c Club.Create(), đ</w:t>
-      </w:r>
-      <w:r>
-        <w:t>ể</w:t>
-      </w:r>
-      <w:r>
-        <w:t xml:space="preserve"> qu</w:t>
-      </w:r>
-      <w:r>
-        <w:t>ả</w:t>
-      </w:r>
-      <w:r>
-        <w:t>n lý danh m</w:t>
-      </w:r>
-      <w:r>
-        <w:t>ụ</w:t>
-      </w:r>
-      <w:r>
-        <w:t>c các CLB ho</w:t>
-      </w:r>
-      <w:r>
-        <w:t>ạ</w:t>
-      </w:r>
-      <w:r>
-        <w:t>t đ</w:t>
-      </w:r>
-      <w:r>
-        <w:t>ộ</w:t>
-      </w:r>
-      <w:r>
-        <w:t>ng h</w:t>
-      </w:r>
-      <w:r>
-        <w:t>ợ</w:t>
-      </w:r>
-      <w:r>
-        <w:t>p l</w:t>
-      </w:r>
-      <w:r>
-        <w:t>ệ</w:t>
-      </w:r>
-      <w:r>
-        <w:t xml:space="preserve"> trong trư</w:t>
-      </w:r>
-      <w:r>
-        <w:t>ờ</w:t>
-      </w:r>
-      <w:r>
-        <w:t>ng.</w:t>
-      </w:r>
-    </w:p>
-    <w:p>
-      <w:pPr>
-        <w:spacing w:after="20"/>
-        <w:ind w:left="288"/>
-      </w:pPr>
-      <w:r>
-        <w:rPr>
-          <w:b/>
-        </w:rPr>
-        <w:t>• Tiêu chí 1 (H</w:t>
-      </w:r>
-      <w:r>
-        <w:rPr>
-          <w:b/>
-        </w:rPr>
-        <w:t>ợ</w:t>
-      </w:r>
-      <w:r>
-        <w:rPr>
-          <w:b/>
-        </w:rPr>
-        <w:t>p l</w:t>
-      </w:r>
-      <w:r>
-        <w:rPr>
-          <w:b/>
-        </w:rPr>
-        <w:t>ệ</w:t>
-      </w:r>
-      <w:r>
-        <w:rPr>
-          <w:b/>
-        </w:rPr>
-        <w:t xml:space="preserve">): </w:t>
-      </w:r>
-      <w:r>
-        <w:t>Given thông tin tên CLB h</w:t>
-      </w:r>
-      <w:r>
-        <w:t>ợ</w:t>
-      </w:r>
-      <w:r>
-        <w:t>p l</w:t>
-      </w:r>
-      <w:r>
-        <w:t>ệ</w:t>
-      </w:r>
-      <w:r>
-        <w:t xml:space="preserve"> (không r</w:t>
-      </w:r>
-      <w:r>
-        <w:t>ỗ</w:t>
-      </w:r>
-      <w:r>
-        <w:t>ng, có mô t</w:t>
-      </w:r>
-      <w:r>
-        <w:t>ả</w:t>
-      </w:r>
-      <w:r>
-        <w:t>), When Admin t</w:t>
-      </w:r>
-      <w:r>
-        <w:t>ạ</w:t>
-      </w:r>
-      <w:r>
-        <w:t>o CLB, Then đ</w:t>
-      </w:r>
-      <w:r>
-        <w:t>ố</w:t>
-      </w:r>
-      <w:r>
-        <w:t>i tư</w:t>
-      </w:r>
-      <w:r>
-        <w:t>ợ</w:t>
-      </w:r>
-      <w:r>
-        <w:t>ng Club đư</w:t>
-      </w:r>
-      <w:r>
-        <w:t>ợ</w:t>
-      </w:r>
-      <w:r>
-        <w:t>c t</w:t>
-      </w:r>
-      <w:r>
-        <w:t>ạ</w:t>
-      </w:r>
-      <w:r>
-        <w:t>o thành công v</w:t>
-      </w:r>
-      <w:r>
-        <w:t>ớ</w:t>
-      </w:r>
-      <w:r>
-        <w:t>i mã đ</w:t>
-      </w:r>
-      <w:r>
-        <w:t>ị</w:t>
-      </w:r>
-      <w:r>
-        <w:t>nh danh Id và th</w:t>
-      </w:r>
-      <w:r>
-        <w:t>ờ</w:t>
-      </w:r>
-      <w:r>
-        <w:t>i gian t</w:t>
-      </w:r>
-      <w:r>
-        <w:t>ạ</w:t>
-      </w:r>
-      <w:r>
-        <w:t>o m</w:t>
-      </w:r>
-      <w:r>
-        <w:t>ớ</w:t>
-      </w:r>
-      <w:r>
-        <w:t>i.</w:t>
-      </w:r>
-    </w:p>
-    <w:p>
-      <w:pPr>
-        <w:spacing w:after="60"/>
-        <w:ind w:left="288"/>
-      </w:pPr>
-      <w:r>
-        <w:rPr>
-          <w:b/>
-        </w:rPr>
-        <w:t>• Tiêu chí 2 (Ngo</w:t>
-      </w:r>
-      <w:r>
-        <w:rPr>
-          <w:b/>
-        </w:rPr>
-        <w:t>ạ</w:t>
-      </w:r>
-      <w:r>
-        <w:rPr>
-          <w:b/>
-        </w:rPr>
-        <w:t>i l</w:t>
-      </w:r>
-      <w:r>
-        <w:rPr>
-          <w:b/>
-        </w:rPr>
-        <w:t>ệ</w:t>
-      </w:r>
-      <w:r>
-        <w:rPr>
-          <w:b/>
-        </w:rPr>
-        <w:t>/L</w:t>
-      </w:r>
-      <w:r>
-        <w:rPr>
-          <w:b/>
-        </w:rPr>
-        <w:t>ỗ</w:t>
-      </w:r>
-      <w:r>
-        <w:rPr>
-          <w:b/>
-        </w:rPr>
-        <w:t xml:space="preserve">i): </w:t>
-      </w:r>
-      <w:r>
-        <w:t>Given thông tin tên CLB đ</w:t>
-      </w:r>
-      <w:r>
-        <w:t>ể</w:t>
-      </w:r>
-      <w:r>
-        <w:t xml:space="preserve"> tr</w:t>
-      </w:r>
-      <w:r>
-        <w:t>ố</w:t>
-      </w:r>
-      <w:r>
-        <w:t>ng, When Admin th</w:t>
-      </w:r>
-      <w:r>
-        <w:t>ự</w:t>
-      </w:r>
-      <w:r>
-        <w:t>c hi</w:t>
-      </w:r>
-      <w:r>
-        <w:t>ệ</w:t>
-      </w:r>
-      <w:r>
-        <w:t>n t</w:t>
-      </w:r>
-      <w:r>
-        <w:t>ạ</w:t>
-      </w:r>
-      <w:r>
-        <w:t>o, Then h</w:t>
-      </w:r>
-      <w:r>
-        <w:t>ệ</w:t>
-      </w:r>
-      <w:r>
-        <w:t xml:space="preserve"> th</w:t>
-      </w:r>
-      <w:r>
-        <w:t>ố</w:t>
-      </w:r>
-      <w:r>
-        <w:t>ng báo l</w:t>
-      </w:r>
-      <w:r>
-        <w:t>ỗ</w:t>
-      </w:r>
-      <w:r>
-        <w:t>i ArgumentException và ngăn ch</w:t>
-      </w:r>
-      <w:r>
-        <w:t>ặ</w:t>
-      </w:r>
-      <w:r>
-        <w:t>n vi</w:t>
-      </w:r>
-      <w:r>
-        <w:t>ệ</w:t>
-      </w:r>
-      <w:r>
-        <w:t>c t</w:t>
-      </w:r>
-      <w:r>
-        <w:t>ạ</w:t>
-      </w:r>
-      <w:r>
-        <w:t>o đ</w:t>
-      </w:r>
-      <w:r>
-        <w:t>ố</w:t>
-      </w:r>
-      <w:r>
-        <w:t>i tư</w:t>
-      </w:r>
-      <w:r>
-        <w:t>ợ</w:t>
-      </w:r>
-      <w:r>
-        <w:t>ng trong b</w:t>
-      </w:r>
-      <w:r>
-        <w:t>ộ</w:t>
-      </w:r>
-      <w:r>
-        <w:t xml:space="preserve"> nh</w:t>
-      </w:r>
-      <w:r>
-        <w:t>ớ</w:t>
-      </w:r>
-      <w:r>
-        <w:t>.</w:t>
+          <w:sz w:val="24"/>
+          <w:szCs w:val="24"/>
+          <w:lang w:val="vi-VN"/>
+        </w:rPr>
+        <w:t>ỗi): Given thông tin tên CLB để trống, When Admin thực hiện tạo, Then hệ thống báo lỗi và ngăn chặn việc tạo đối tượng trong bộ nhớ.</w:t>
       </w:r>
     </w:p>
     <w:sectPr>

</xml_diff>

<commit_message>
docs: đồng bộ tài liệu BT34.docx
</commit_message>
<xml_diff>
--- a/BT34.docx
+++ b/BT34.docx
@@ -116,7 +116,7 @@
           <w:szCs w:val="24"/>
           <w:lang w:val="vi-VN"/>
         </w:rPr>
-        <w:t>1 - S</w:t>
+        <w:t xml:space="preserve">1 - </w:t>
       </w:r>
       <w:r>
         <w:rPr>
@@ -126,7 +126,17 @@
           <w:szCs w:val="24"/>
           <w:lang w:val="vi-VN"/>
         </w:rPr>
-        <w:t xml:space="preserve">inh viên: </w:t>
+        <w:t>Member</w:t>
+      </w:r>
+      <w:r>
+        <w:rPr>
+          <w:b/>
+          <w:bCs/>
+          <w:sz w:val="24"/>
+          <w:szCs w:val="24"/>
+          <w:lang w:val="vi-VN"/>
+        </w:rPr>
+        <w:t xml:space="preserve">: </w:t>
       </w:r>
       <w:r>
         <w:rPr>
@@ -353,7 +363,17 @@
           <w:szCs w:val="24"/>
           <w:lang w:val="vi-VN"/>
         </w:rPr>
-        <w:t xml:space="preserve">Sinh viên: </w:t>
+        <w:t>Member</w:t>
+      </w:r>
+      <w:r>
+        <w:rPr>
+          <w:b/>
+          <w:bCs/>
+          <w:sz w:val="24"/>
+          <w:szCs w:val="24"/>
+          <w:lang w:val="vi-VN"/>
+        </w:rPr>
+        <w:t xml:space="preserve">: </w:t>
       </w:r>
       <w:r>
         <w:rPr>

</xml_diff>